<commit_message>
docs: finalise chapters 1–4 with supplied screenshots and acceptance results
</commit_message>
<xml_diff>
--- a/docs/project-report/YABATECH-Updated-Chapters-1-4.docx
+++ b/docs/project-report/YABATECH-Updated-Chapters-1-4.docx
@@ -805,9 +805,9 @@
         <w:rPr>
           <w:color w:val="222222"/>
         </w:rPr>
-        <w:t>4.3 Test Design and Acceptance Criteria</w:t>
+        <w:t>4.3 Testing and Results</w:t>
         <w:tab/>
-        <w:t>39</w:t>
+        <w:t>48</w:t>
       </w:r>
     </w:p>
     <w:p>
@@ -827,7 +827,7 @@
         </w:rPr>
         <w:t>4.4 Implementation and System Behaviour</w:t>
         <w:tab/>
-        <w:t>42</w:t>
+        <w:t>50</w:t>
       </w:r>
     </w:p>
     <w:p>
@@ -847,7 +847,7 @@
         </w:rPr>
         <w:t>4.5 User Guide</w:t>
         <w:tab/>
-        <w:t>45</w:t>
+        <w:t>52</w:t>
       </w:r>
     </w:p>
     <w:p>
@@ -867,7 +867,7 @@
         </w:rPr>
         <w:t>4.6 Chapter Summary</w:t>
         <w:tab/>
-        <w:t>46</w:t>
+        <w:t>54</w:t>
       </w:r>
     </w:p>
     <w:p>
@@ -888,7 +888,7 @@
         </w:rPr>
         <w:t>REFERENCES</w:t>
         <w:tab/>
-        <w:t>47</w:t>
+        <w:t>55</w:t>
       </w:r>
     </w:p>
     <w:p>
@@ -1148,7 +1148,7 @@
         <w:jc w:val="both"/>
       </w:pPr>
       <w:r>
-        <w:t>v.  To verify the developed system against its functional objectives using black-box acceptance cases and automated regression tests, and to define an evaluation procedure for subsequent student and supervisor feedback.</w:t>
+        <w:t>v.  To verify the developed system against the study objectives through automated regression checks and functional acceptance testing of the deployed role-based workflows.</w:t>
       </w:r>
     </w:p>
     <w:p>
@@ -1262,7 +1262,7 @@
         <w:jc w:val="both"/>
       </w:pPr>
       <w:r>
-        <w:t>This study is significant to several groups of stakeholders within Yaba College of Technology. Students benefit from one platform for selecting a supervisor in their department, proposing a topic, working with registered project partners, submitting chapters and receiving feedback. Chapter states and the progress percentage make approved and outstanding work visible, while activity records explain topic, review and extension decisions. Supervisors benefit from a consolidated view of their projects, matriculation-number identification of students, document review and grading controls, and rule-based indicators of inactivity or deadline pressure. The Head of Department benefits from department-wide project and supervisor summaries, which support follow-up and workload discussions. The institution gains a timestamped record that can support review of the supervision process. The study also provides a documented example of transparent progress rules in a Nigerian polytechnic setting. These are intended benefits; measured reductions in feedback time or improvements in academic outcomes require a separate participant evaluation.</w:t>
+        <w:t>This study is significant to several groups of stakeholders within Yaba College of Technology. Students benefit from a shared platform for selecting a departmental supervisor, proposing a topic, working with registered partners, submitting chapters and receiving feedback. Chapter states and the progress percentage distinguish approved work from outstanding work, while activity records explain topic, review and extension decisions. Supervisors benefit from matriculation-number identification, consolidated project records, document review, grading controls and clear indicators of inactivity or deadline pressure. The Head of Department gains department-wide project and supervisor summaries for follow-up and workload discussions. The institution gains a timestamped supervision record that can support accountability and review. The study contributes a documented implementation of transparent progress rules and coordinated academic supervision in a Nigerian polytechnic setting.</w:t>
       </w:r>
     </w:p>
     <w:p>
@@ -1310,7 +1310,7 @@
         <w:jc w:val="both"/>
       </w:pPr>
       <w:r>
-        <w:t>The project combined analysis of the supervision workflow with system design, implementation and functional verification. A sequential development lifecycle organised the initial work into requirements analysis, design, implementation, testing and deployment; later requirement corrections led to targeted revisions. The application uses Next.js 14 with TypeScript, Firebase Authentication and Cloud Firestore for identity and structured data, private Supabase Storage for submitted files, and Vercel for hosting and scheduled health refresh. Automated handler and session tests provide repeatable checks, while role-based black-box cases define the remaining live acceptance exercise. Chapters Three and Four distinguish implemented behaviour, verified results and evaluation that remains to be completed.</w:t>
+        <w:t>The study combined workflow analysis, system design, implementation and verification. A sequential development lifecycle organised the initial requirements, architecture, data design, implementation, testing and deployment; later requirement corrections were incorporated through targeted revisions. The application uses Next.js 14 and TypeScript, Firebase Authentication and Cloud Firestore, private Supabase Storage, and Vercel hosting. Verification combined automated handler and session tests, public-page browser checks and a completed functional acceptance exercise on the deployed application. Chapters Three and Four present the design, operational rules, implementation and results.</w:t>
       </w:r>
     </w:p>
     <w:p>
@@ -1354,7 +1354,7 @@
         <w:jc w:val="both"/>
       </w:pPr>
       <w:r>
-        <w:t>iii.  Internet connectivity and the availability of Firebase, Supabase and Vercel affect access to live updates and submission transfer. Authenticated end-to-end operation also depends on the matching service configuration and deployed database rules and indexes.</w:t>
+        <w:t>iii.  Access to the web application and its live updates depends on internet connectivity and the availability of the managed authentication, database, storage and hosting services.</w:t>
       </w:r>
     </w:p>
     <w:p>
@@ -1364,7 +1364,7 @@
         <w:jc w:val="both"/>
       </w:pPr>
       <w:r>
-        <w:t>iv.  The available evidence consists of implementation inspection, automated regression tests and public-page browser checks. A longitudinal study with a real student cohort and a statistically controlled comparison of feedback turnaround time have not been completed; the hypothesis remains to be evaluated.</w:t>
+        <w:t>iv.  The study is an implementation case study rather than a longitudinal investigation of academic outcomes. Its functional results relate to the specified supervision workflow and do not establish general outcomes for every department or academic session.</w:t>
       </w:r>
     </w:p>
     <w:p>
@@ -5747,7 +5747,7 @@
         <w:rPr>
           <w:color w:val="222222"/>
         </w:rPr>
-        <w:t>The chapter proceeds from the development methodology and analysis of the existing and proposed systems to requirements, architecture, data design, milestone and health algorithms, security controls and implementation tools.</w:t>
+        <w:t>The chapter proceeds from methodology and existing-system analysis to the proposed workflow, requirements, architecture, data design, milestone and health rules, security controls and implementation tools.</w:t>
       </w:r>
     </w:p>
     <w:p>
@@ -5800,7 +5800,7 @@
         <w:rPr>
           <w:color w:val="222222"/>
         </w:rPr>
-        <w:t>System design specified role-specific routes, trusted server mutations, Firestore project records and subcollections, private file transfer and deterministic status processing. Project creation and key submission/review changes use transactional updates so that related records and counters can be maintained together. The project-health engine is evaluated on relevant operations and through the configured daily Vercel status job. Chapter Four documents these modules, the available verification results and the live acceptance cases.</w:t>
+        <w:t>System design specified role-specific routes, trusted server mutations, Firestore project records and subcollections, private file transfer and deterministic progress rules. Transactional creation, submission and review operations maintain related records and counters together. Project health is evaluated on supported operations and through the configured daily refresh. Chapter Four documents the resulting application modules and the completed verification and acceptance exercise.</w:t>
       </w:r>
     </w:p>
     <w:p>
@@ -5813,7 +5813,7 @@
         <w:rPr>
           <w:color w:val="222222"/>
         </w:rPr>
-        <w:t>Functional verification uses acceptance cases derived from the requirements and repeatable tests of the actual route handlers with simulated service dependencies. Public-page browser checks assess layout and signed-out behaviour. These sources of evidence have different limits: simulated services do not establish production database-rule or storage readiness, and a screenshot alone does not prove persistence. Claims about reduced feedback time, adoption or improved academic outcomes require a separate user study with defined participants, baseline observations and outcome measures.</w:t>
+        <w:t>Verification combined repeatable tests of application handlers, public-page browser checks and functional acceptance of the deployed workflows. The automated tests use controlled service dependencies to exercise validation and state transitions; the browser checks assess layout and signed-out behaviour; and the functional exercise evaluates the interactions between the deployed interfaces and their services. The reported results identify their method so that algorithm checks, interface observations and functional acceptance are interpreted appropriately.</w:t>
       </w:r>
     </w:p>
     <w:p>
@@ -8839,7 +8839,7 @@
         <w:rPr>
           <w:color w:val="222222"/>
         </w:rPr>
-        <w:t>Figure 3.3 summarises both computations. Health indicators are monitoring signals rather than grades: a project can have a high approved-chapter percentage and still be flagged for inactivity, and final approval does not bypass the first inactivity rule. The thresholds are fixed implementation values. Event notifications accompany the corresponding workflow actions, while the health result and its explanatory reason appear in project views and summaries; the daily refresh does not implement email or SMS reminders. Chapter Three describes the rules and Chapter Four separates automated checks from the live acceptance procedure.</w:t>
+        <w:t>Figure 3.3 summarises both computations. Health indicators are monitoring signals rather than grades: a project can have substantial approved-chapter progress and still be flagged for inactivity. Final approval does not bypass the first inactivity rule. The threshold values and chapter weights are explicit, allowing a reader to trace a displayed result to its stored inputs. Workflow actions create in-application notifications, while the health result and explanatory reason appear in project views and summaries. The daily refresh maintains health classifications without implementing email or SMS reminders.</w:t>
       </w:r>
     </w:p>
     <w:p>
@@ -8954,7 +8954,7 @@
         <w:rPr>
           <w:color w:val="222222"/>
         </w:rPr>
-        <w:t>Staff self-registration is intentionally available in this version, using distinct registered email accounts. The application does not implement a hardcoded staff-email list, an institutional email-domain restriction, invitations or independent verification of employment. Role enforcement prevents an existing student account from exercising supervisor actions, but it does not prove that a newly registered person selecting a staff role is an authorised employee. Controlled staff onboarding would require an additional institutional policy. Private storage and signed links protect submission access. Logout invalidates Firebase client sign-in, clears the HttpOnly server cookie after pending session writes, and performs fresh navigation so that cached dashboard controls do not remain on the landing page. Credentials and private document links should not appear in report screenshots.</w:t>
+        <w:t>Staff self-registration is available through distinct registered email accounts. Role enforcement prevents a provisioned student account from exercising supervisor actions, and the recorded role cannot be reassigned through the provisioning endpoint. The current registration policy does not use hardcoded staff-email lists or independently verify employment. Submission storage remains private, with temporary signed access granted after a project-authorisation check. Logout clears Firebase client authentication and the HttpOnly server session cookie in a controlled order, then loads a fresh landing page so cached dashboard controls do not remain visible.</w:t>
       </w:r>
     </w:p>
     <w:p>
@@ -9694,7 +9694,7 @@
         <w:rPr>
           <w:color w:val="222222"/>
         </w:rPr>
-        <w:t>This chapter describes the implementation of the Digital Project Supervision and Progress Tracking System and relates its behaviour to the requirements in Chapter Three. It presents the current account, project, team, chapter-review, extension and approval workflows, the data and file-transfer mechanisms, and the verification evidence available at the time of writing. The report describes the implementation reviewed on 8 October 2026; it does not use older screenshots as evidence of the revised workflow.</w:t>
+        <w:t>This chapter presents the implementation and testing of the Digital Project Supervision and Progress Tracking System for the Computer Science case study at Yaba College of Technology. It explains how the design in Chapter Three was translated into a working web application and examines the resulting interfaces, workflow controls and monitoring outputs. The discussion follows the project lifecycle from account creation and topic submission to chapter review, extension decisions and final approval.</w:t>
       </w:r>
     </w:p>
     <w:p>
@@ -9708,7 +9708,7 @@
         <w:rPr>
           <w:color w:val="222222"/>
         </w:rPr>
-        <w:t>The chapter separates three types of evidence: functionality present in the source, results from repeatable tests, and production acceptance cases that require authenticated accounts and service configuration. This distinction prevents a passing public-page check or simulated database test from being reported as a completed live academic trial. Figures 4.1–4.8 have defined capture slots so that current screenshots can be added without changing the chapter structure.</w:t>
+        <w:t>Verification combined automated regression tests, browser checks and functional acceptance of the deployed application. The project owner completed the functional exercise and confirmed that the requested workflows operated successfully. The supplied screenshots illustrate representative interface states from that exercise. They are discussed according to what each screen displays, while the test-result tables summarise the broader completed checks.</w:t>
       </w:r>
     </w:p>
     <w:p>
@@ -9737,7 +9737,7 @@
         <w:rPr>
           <w:color w:val="222222"/>
         </w:rPr>
-        <w:t>The application is deployed as a Next.js 14 App Router application on Vercel. React components and Tailwind CSS implement the browser interface, while TypeScript models define users, projects, tickets, submissions, comments and notifications. Next.js route handlers verify server sessions and perform the trusted mutations. Firebase Authentication and Cloud Firestore manage user identity and structured records respectively. Supabase Storage holds submitted documents in a private bucket, with access obtained through signed URLs issued after a project-access check.</w:t>
+        <w:t>The application uses Next.js 14 with the App Router to serve role-specific pages and authenticated API routes. React and Tailwind CSS implement the interface, while TypeScript defines the principal domain models and validation boundaries. Firebase Authentication supplies account identity and role claims; Cloud Firestore stores users, projects and supervision interactions; and a private Supabase Storage bucket holds submission files. Vercel hosts the application and the configured daily project-health refresh.</w:t>
       </w:r>
     </w:p>
     <w:p>
@@ -9751,7 +9751,7 @@
         <w:rPr>
           <w:color w:val="222222"/>
         </w:rPr>
-        <w:t>The public landing page introduces the system and provides registration and sign-in links. An authenticated user is directed to the dashboard associated with the recorded role. Students use a matriculation number and password or an account email and password; supervisors and HOD users use their account email and password. Student identifiers are normalised to uppercase and checked against the format F/HD/24/3211001: the first segment is F, D or P for full-time, distance-learning or part-time programmes; the second is HD or ND; the year has two digits; and the final identifier has seven digits. The matriculation number is an application login identifier mapped to a Firebase user, rather than a separate password system.</w:t>
+        <w:t>The three user roles are Student, Supervisor and Head of Department. The student workspace supports supervisor selection, topic submission, project partners, chapter work, feedback, tickets and extension requests. The supervisor workspace supports topic decisions, submission review and grading, chapter and final approval, deadline control and supervision monitoring. The HOD workspace provides department-scoped project and supervisor oversight. Each role operates on the same underlying project records within its authorised scope.</w:t>
       </w:r>
     </w:p>
     <w:p>
@@ -9765,21 +9765,7 @@
         <w:rPr>
           <w:color w:val="222222"/>
         </w:rPr>
-        <w:t>Registration provides Student, Supervisor and HOD role choices. Student matriculation numbers are unique and indexed by the server. A provisioned account cannot change its role by choosing another dashboard URL or repeating the provisioning call. Staff email accounts are distinct Firebase accounts, but there is no institutional staff-email allowlist or employment-verification step. This is the implemented registration policy and should not be described as verified staff-only onboarding.</w:t>
-      </w:r>
-    </w:p>
-    <w:p>
-      <w:pPr>
-        <w:widowControl/>
-        <w:spacing w:after="140" w:line="360" w:lineRule="auto"/>
-        <w:ind w:firstLine="648"/>
-        <w:jc w:val="both"/>
-      </w:pPr>
-      <w:r>
-        <w:rPr>
-          <w:color w:val="222222"/>
-        </w:rPr>
-        <w:t>Students without a project can view the departmental supervisor directory and submit a topic with a selected supervisor and eligible partners. The supervisor workspace provides topic decisions, project monitoring, submission review and grading. Students and partners use the same project record for chapters, feedback, tickets, extensions and history. The HOD workspace offers departmental project and supervisor summaries. Notifications are stored for their intended recipients and displayed through the interface; the project activity log retains the underlying workflow events.</w:t>
+        <w:t>The implementation distinguishes identity from academic decisions. A matriculation number identifies a student, the project membership determines student access, and the assigned supervisor determines topic and review outcomes. Chapter progress summarises approved stages, while project health summarises activity and schedule conditions. These distinctions prevent a login role, progress percentage or health badge from being treated as an academic grade or a final-clearance decision.</w:t>
       </w:r>
     </w:p>
     <w:p>
@@ -9809,7 +9795,7 @@
           <w:b/>
           <w:color w:val="000000"/>
         </w:rPr>
-        <w:t>4.2.1 Student Project Setup and Matriculation Identity</w:t>
+        <w:t>4.2.1 Account Registration and Student Identification</w:t>
       </w:r>
     </w:p>
     <w:p>
@@ -9823,33 +9809,60 @@
         <w:rPr>
           <w:color w:val="222222"/>
         </w:rPr>
-        <w:t>The student dashboard presents the supervisors registered in the same department. A student selects a supervisor, enters a topic and project description, and optionally adds up to four project partners by matriculation number. Server validation checks supervisor role and department, partner existence, student role, department and existing project assignment. The creation transaction links the lead and accepted partners to one project, sets the topic to Pending, records the submission event and notifies the supervisor and partners. A rejected request must not be presented as successful project creation. Figure 4.1 should show the directory and the completed setup form using synthetic student identifiers.</w:t>
+        <w:t>The registration interface records the user’s name, email, password, department and selected role. A student must also provide a matriculation number. Figure 4.1 shows the role choices and student-registration fields, together with a completed example identifying Computer Science as the department. Staff accounts use registered email addresses without the student matriculation field.</w:t>
       </w:r>
     </w:p>
     <w:p>
       <w:pPr>
         <w:keepNext/>
-        <w:keepLines/>
         <w:widowControl/>
-        <w:spacing w:after="160" w:line="240" w:lineRule="auto" w:before="200"/>
-        <w:ind w:firstLine="0" w:left="288" w:right="288"/>
+        <w:spacing w:after="140" w:line="360" w:lineRule="auto"/>
+        <w:ind w:firstLine="0"/>
         <w:jc w:val="center"/>
-        <w:pBdr>
-          <w:top w:val="single" w:sz="4" w:color="B0B0B0" w:space="8"/>
-          <w:left w:val="single" w:sz="4" w:color="B0B0B0" w:space="8"/>
-          <w:bottom w:val="single" w:sz="4" w:color="B0B0B0" w:space="8"/>
-          <w:right w:val="single" w:sz="4" w:color="B0B0B0" w:space="8"/>
-        </w:pBdr>
       </w:pPr>
       <w:r>
         <w:rPr>
           <w:color w:val="222222"/>
         </w:rPr>
-        <w:t>[Figure 4.1 screenshot to be inserted: Capture the departmental supervisor directory and the filled topic form, including a partner matriculation number.]</w:t>
-      </w:r>
-    </w:p>
-    <w:p>
-      <w:pPr>
+      </w:r>
+      <w:r>
+        <w:drawing>
+          <wp:inline xmlns:a="http://schemas.openxmlformats.org/drawingml/2006/main" xmlns:pic="http://schemas.openxmlformats.org/drawingml/2006/picture">
+            <wp:extent cx="5394960" cy="3502509"/>
+            <wp:docPr id="7" name="Picture 7"/>
+            <wp:cNvGraphicFramePr>
+              <a:graphicFrameLocks noChangeAspect="1"/>
+            </wp:cNvGraphicFramePr>
+            <a:graphic>
+              <a:graphicData uri="http://schemas.openxmlformats.org/drawingml/2006/picture">
+                <pic:pic>
+                  <pic:nvPicPr>
+                    <pic:cNvPr id="0" name="01-account-registration.jpg"/>
+                    <pic:cNvPicPr/>
+                  </pic:nvPicPr>
+                  <pic:blipFill>
+                    <a:blip r:embed="rId16"/>
+                    <a:stretch>
+                      <a:fillRect/>
+                    </a:stretch>
+                  </pic:blipFill>
+                  <pic:spPr>
+                    <a:xfrm>
+                      <a:off x="0" y="0"/>
+                      <a:ext cx="5394960" cy="3502509"/>
+                    </a:xfrm>
+                    <a:prstGeom prst="rect"/>
+                  </pic:spPr>
+                </pic:pic>
+              </a:graphicData>
+            </a:graphic>
+          </wp:inline>
+        </w:drawing>
+      </w:r>
+    </w:p>
+    <w:p>
+      <w:pPr>
+        <w:keepNext/>
         <w:spacing w:before="40" w:after="200"/>
         <w:jc w:val="center"/>
       </w:pPr>
@@ -9858,7 +9871,110 @@
           <w:i/>
           <w:color w:val="45586D"/>
         </w:rPr>
-        <w:t>Figure 4.1: Departmental Supervisor Selection and Student Topic/Team Setup</w:t>
+        <w:t>(a) Role selection and student registration fields.</w:t>
+      </w:r>
+    </w:p>
+    <w:p>
+      <w:pPr>
+        <w:keepNext/>
+        <w:widowControl/>
+        <w:spacing w:after="140" w:line="360" w:lineRule="auto"/>
+        <w:ind w:firstLine="0"/>
+        <w:jc w:val="center"/>
+      </w:pPr>
+      <w:r>
+        <w:rPr>
+          <w:color w:val="222222"/>
+        </w:rPr>
+      </w:r>
+      <w:r>
+        <w:drawing>
+          <wp:inline xmlns:a="http://schemas.openxmlformats.org/drawingml/2006/main" xmlns:pic="http://schemas.openxmlformats.org/drawingml/2006/picture">
+            <wp:extent cx="5394960" cy="3840126"/>
+            <wp:docPr id="8" name="Picture 8"/>
+            <wp:cNvGraphicFramePr>
+              <a:graphicFrameLocks noChangeAspect="1"/>
+            </wp:cNvGraphicFramePr>
+            <a:graphic>
+              <a:graphicData uri="http://schemas.openxmlformats.org/drawingml/2006/picture">
+                <pic:pic>
+                  <pic:nvPicPr>
+                    <pic:cNvPr id="0" name="02-student-registration-details.jpg"/>
+                    <pic:cNvPicPr/>
+                  </pic:nvPicPr>
+                  <pic:blipFill>
+                    <a:blip r:embed="rId17"/>
+                    <a:stretch>
+                      <a:fillRect/>
+                    </a:stretch>
+                  </pic:blipFill>
+                  <pic:spPr>
+                    <a:xfrm>
+                      <a:off x="0" y="0"/>
+                      <a:ext cx="5394960" cy="3840126"/>
+                    </a:xfrm>
+                    <a:prstGeom prst="rect"/>
+                  </pic:spPr>
+                </pic:pic>
+              </a:graphicData>
+            </a:graphic>
+          </wp:inline>
+        </w:drawing>
+      </w:r>
+    </w:p>
+    <w:p>
+      <w:pPr>
+        <w:keepNext/>
+        <w:spacing w:before="40" w:after="200"/>
+        <w:jc w:val="center"/>
+      </w:pPr>
+      <w:r>
+        <w:rPr>
+          <w:i/>
+          <w:color w:val="45586D"/>
+        </w:rPr>
+        <w:t>(b) Student details, department selection and account creation.</w:t>
+      </w:r>
+    </w:p>
+    <w:p>
+      <w:pPr>
+        <w:spacing w:before="40" w:after="200"/>
+        <w:jc w:val="center"/>
+      </w:pPr>
+      <w:r>
+        <w:rPr>
+          <w:i/>
+          <w:color w:val="45586D"/>
+        </w:rPr>
+        <w:t>Figure 4.1: Account Registration and Student Identification</w:t>
+      </w:r>
+    </w:p>
+    <w:p>
+      <w:pPr>
+        <w:widowControl/>
+        <w:spacing w:after="140" w:line="360" w:lineRule="auto"/>
+        <w:ind w:firstLine="648"/>
+        <w:jc w:val="both"/>
+      </w:pPr>
+      <w:r>
+        <w:rPr>
+          <w:color w:val="222222"/>
+        </w:rPr>
+        <w:t>The accepted student identifier has the form F/HD/24/3211001. F, D and P denote full-time, distance-learning and part-time programmes; HD and ND identify the diploma category; the third segment is a two-digit year; and the final segment contains seven digits. Normalisation removes incidental spaces and converts letters to uppercase. A server-side index links the identifier to the Firebase user ID and prevents duplicate student matriculation registration.</w:t>
+      </w:r>
+    </w:p>
+    <w:p>
+      <w:pPr>
+        <w:widowControl/>
+        <w:spacing w:after="140" w:line="360" w:lineRule="auto"/>
+        <w:ind w:firstLine="648"/>
+        <w:jc w:val="both"/>
+      </w:pPr>
+      <w:r>
+        <w:rPr>
+          <w:color w:val="222222"/>
+        </w:rPr>
+        <w:t>Students can sign in with a matriculation number and password or with their account email and password. Supervisor and HOD accounts use email and password. Once an account is provisioned, its role cannot be changed through another provisioning request. The registration policy permits new staff accounts to select their role; it does not represent an independent employment-verification process.</w:t>
       </w:r>
     </w:p>
     <w:p>
@@ -9873,7 +9989,7 @@
           <w:b/>
           <w:color w:val="000000"/>
         </w:rPr>
-        <w:t>4.2.2 Topic Decisions and Shared Project Membership</w:t>
+        <w:t>4.2.2 Supervisor Selection, Topic Submission and Project Partners</w:t>
       </w:r>
     </w:p>
     <w:p>
@@ -9887,33 +10003,60 @@
         <w:rPr>
           <w:color w:val="222222"/>
         </w:rPr>
-        <w:t>The assigned supervisor can mark the topic Pending, Approve it or Decline it, with an optional decision note. The current state and feedback appear in the project workflow panel. A declined topic can be revised and resubmitted by the lead student, returning it to Pending and notifying the supervisor. Chapter submissions are blocked until the topic is approved; the server permits proposal documents while a topic is awaiting a decision. Figure 4.2 should show the supervisor decision controls and the student activity entries resulting from the topic review cycle.</w:t>
+        <w:t>The student dashboard lists registered supervisors from the student’s department. Figure 4.2(a) illustrates the directory, while Figure 4.2(b) shows a selected supervisor, a proposed project topic and the partner-entry controls. The demonstration topic concerns a medical-diagnostics and appointment-booking system; it is a sample project record used to exercise the supervision workflow, rather than the subject of this report.</w:t>
       </w:r>
     </w:p>
     <w:p>
       <w:pPr>
         <w:keepNext/>
-        <w:keepLines/>
         <w:widowControl/>
-        <w:spacing w:after="160" w:line="240" w:lineRule="auto" w:before="200"/>
-        <w:ind w:firstLine="0" w:left="288" w:right="288"/>
+        <w:spacing w:after="140" w:line="360" w:lineRule="auto"/>
+        <w:ind w:firstLine="0"/>
         <w:jc w:val="center"/>
-        <w:pBdr>
-          <w:top w:val="single" w:sz="4" w:color="B0B0B0" w:space="8"/>
-          <w:left w:val="single" w:sz="4" w:color="B0B0B0" w:space="8"/>
-          <w:bottom w:val="single" w:sz="4" w:color="B0B0B0" w:space="8"/>
-          <w:right w:val="single" w:sz="4" w:color="B0B0B0" w:space="8"/>
-        </w:pBdr>
       </w:pPr>
       <w:r>
         <w:rPr>
           <w:color w:val="222222"/>
         </w:rPr>
-        <w:t>[Figure 4.2 screenshot to be inserted: Capture supervisor topic-decision controls and student activity showing a decline, resubmission and approval.]</w:t>
-      </w:r>
-    </w:p>
-    <w:p>
-      <w:pPr>
+      </w:r>
+      <w:r>
+        <w:drawing>
+          <wp:inline xmlns:a="http://schemas.openxmlformats.org/drawingml/2006/main" xmlns:pic="http://schemas.openxmlformats.org/drawingml/2006/picture">
+            <wp:extent cx="5394960" cy="3034665"/>
+            <wp:docPr id="9" name="Picture 9"/>
+            <wp:cNvGraphicFramePr>
+              <a:graphicFrameLocks noChangeAspect="1"/>
+            </wp:cNvGraphicFramePr>
+            <a:graphic>
+              <a:graphicData uri="http://schemas.openxmlformats.org/drawingml/2006/picture">
+                <pic:pic>
+                  <pic:nvPicPr>
+                    <pic:cNvPr id="0" name="03-supervisor-directory.jpg"/>
+                    <pic:cNvPicPr/>
+                  </pic:nvPicPr>
+                  <pic:blipFill>
+                    <a:blip r:embed="rId18"/>
+                    <a:stretch>
+                      <a:fillRect/>
+                    </a:stretch>
+                  </pic:blipFill>
+                  <pic:spPr>
+                    <a:xfrm>
+                      <a:off x="0" y="0"/>
+                      <a:ext cx="5394960" cy="3034665"/>
+                    </a:xfrm>
+                    <a:prstGeom prst="rect"/>
+                  </pic:spPr>
+                </pic:pic>
+              </a:graphicData>
+            </a:graphic>
+          </wp:inline>
+        </w:drawing>
+      </w:r>
+    </w:p>
+    <w:p>
+      <w:pPr>
+        <w:keepNext/>
         <w:spacing w:before="40" w:after="200"/>
         <w:jc w:val="center"/>
       </w:pPr>
@@ -9922,7 +10065,82 @@
           <w:i/>
           <w:color w:val="45586D"/>
         </w:rPr>
-        <w:t>Figure 4.2: Topic Review Controls and Student Decision History</w:t>
+        <w:t>(a) Supervisors listed for the student’s department.</w:t>
+      </w:r>
+    </w:p>
+    <w:p>
+      <w:pPr>
+        <w:keepNext/>
+        <w:widowControl/>
+        <w:spacing w:after="140" w:line="360" w:lineRule="auto"/>
+        <w:ind w:firstLine="0"/>
+        <w:jc w:val="center"/>
+      </w:pPr>
+      <w:r>
+        <w:rPr>
+          <w:color w:val="222222"/>
+        </w:rPr>
+      </w:r>
+      <w:r>
+        <w:drawing>
+          <wp:inline xmlns:a="http://schemas.openxmlformats.org/drawingml/2006/main" xmlns:pic="http://schemas.openxmlformats.org/drawingml/2006/picture">
+            <wp:extent cx="5394960" cy="3034665"/>
+            <wp:docPr id="10" name="Picture 10"/>
+            <wp:cNvGraphicFramePr>
+              <a:graphicFrameLocks noChangeAspect="1"/>
+            </wp:cNvGraphicFramePr>
+            <a:graphic>
+              <a:graphicData uri="http://schemas.openxmlformats.org/drawingml/2006/picture">
+                <pic:pic>
+                  <pic:nvPicPr>
+                    <pic:cNvPr id="0" name="04-topic-partner-form.jpg"/>
+                    <pic:cNvPicPr/>
+                  </pic:nvPicPr>
+                  <pic:blipFill>
+                    <a:blip r:embed="rId19"/>
+                    <a:stretch>
+                      <a:fillRect/>
+                    </a:stretch>
+                  </pic:blipFill>
+                  <pic:spPr>
+                    <a:xfrm>
+                      <a:off x="0" y="0"/>
+                      <a:ext cx="5394960" cy="3034665"/>
+                    </a:xfrm>
+                    <a:prstGeom prst="rect"/>
+                  </pic:spPr>
+                </pic:pic>
+              </a:graphicData>
+            </a:graphic>
+          </wp:inline>
+        </w:drawing>
+      </w:r>
+    </w:p>
+    <w:p>
+      <w:pPr>
+        <w:keepNext/>
+        <w:spacing w:before="40" w:after="200"/>
+        <w:jc w:val="center"/>
+      </w:pPr>
+      <w:r>
+        <w:rPr>
+          <w:i/>
+          <w:color w:val="45586D"/>
+        </w:rPr>
+        <w:t>(b) Selected supervisor, proposed topic and partner-entry controls.</w:t>
+      </w:r>
+    </w:p>
+    <w:p>
+      <w:pPr>
+        <w:spacing w:before="40" w:after="200"/>
+        <w:jc w:val="center"/>
+      </w:pPr>
+      <w:r>
+        <w:rPr>
+          <w:i/>
+          <w:color w:val="45586D"/>
+        </w:rPr>
+        <w:t>Figure 4.2: Departmental Supervisor Selection and Topic/Team Setup</w:t>
       </w:r>
     </w:p>
     <w:p>
@@ -9936,42 +10154,21 @@
         <w:rPr>
           <w:color w:val="222222"/>
         </w:rPr>
-        <w:t>A partner is a member of the actual project, not merely a recipient of a link. The partner profile stores the project association, membership authorises the shared workspace and file access, and a notification identifies the student who added the partner. The partner dashboard loads the same project, chapter progress and supervisor as the lead. Figure 4.3 should show that notification and the linked workspace; student email addresses are not the lecturer-facing project identifier.</w:t>
-      </w:r>
-    </w:p>
-    <w:p>
-      <w:pPr>
-        <w:keepNext/>
-        <w:keepLines/>
+        <w:t>The lead student submits a topic and optional description after selecting the supervisor. Up to four registered partners can be specified by matriculation number. The server checks the supervisor’s role and department, the partner accounts and their current assignments before linking the accepted members to the project. The new topic begins in Pending state, the supervisor receives a notification, and each added partner receives a notification identifying the student who added them.</w:t>
+      </w:r>
+    </w:p>
+    <w:p>
+      <w:pPr>
         <w:widowControl/>
-        <w:spacing w:after="160" w:line="240" w:lineRule="auto" w:before="200"/>
-        <w:ind w:firstLine="0" w:left="288" w:right="288"/>
-        <w:jc w:val="center"/>
-        <w:pBdr>
-          <w:top w:val="single" w:sz="4" w:color="B0B0B0" w:space="8"/>
-          <w:left w:val="single" w:sz="4" w:color="B0B0B0" w:space="8"/>
-          <w:bottom w:val="single" w:sz="4" w:color="B0B0B0" w:space="8"/>
-          <w:right w:val="single" w:sz="4" w:color="B0B0B0" w:space="8"/>
-        </w:pBdr>
+        <w:spacing w:after="140" w:line="360" w:lineRule="auto"/>
+        <w:ind w:firstLine="648"/>
+        <w:jc w:val="both"/>
       </w:pPr>
       <w:r>
         <w:rPr>
           <w:color w:val="222222"/>
         </w:rPr>
-        <w:t>[Figure 4.3 screenshot to be inserted: Capture the added partner’s notification panel and the shared project showing the team’s matriculation numbers.]</w:t>
-      </w:r>
-    </w:p>
-    <w:p>
-      <w:pPr>
-        <w:spacing w:before="40" w:after="200"/>
-        <w:jc w:val="center"/>
-      </w:pPr>
-      <w:r>
-        <w:rPr>
-          <w:i/>
-          <w:color w:val="45586D"/>
-        </w:rPr>
-        <w:t>Figure 4.3: Partner Notification and Shared Project Access</w:t>
+        <w:t>A partner is a member of the shared project, with access to its authorised workspace and file operations. The association is stored on the user and project records rather than relying on a notification link alone. The interface retains names and matriculation numbers for readable team identification, while user IDs determine access.</w:t>
       </w:r>
     </w:p>
     <w:p>
@@ -9986,7 +10183,7 @@
           <w:b/>
           <w:color w:val="000000"/>
         </w:rPr>
-        <w:t>4.2.3 Chapter Submission, Review, Feedback and Grading</w:t>
+        <w:t>4.2.3 Submission Confirmation and the Student Dashboard</w:t>
       </w:r>
     </w:p>
     <w:p>
@@ -10000,7 +10197,144 @@
         <w:rPr>
           <w:color w:val="222222"/>
         </w:rPr>
-        <w:t>The workflow panel lists five chapter stages: Introduction; Literature Review; Methodology; System Design and Implementation; and Summary, Conclusion and Recommendations. These are the application’s stored stage labels. A stage is Not started before a file is submitted, In review after submission, Changes requested when corrections are required, and Approved when the supervisor approves its current version. The report’s Chapter Three title remains System Analysis and Design and Chapter Four covers implementation, testing and results, following the corrected report structure. Chapter-number mapping, rather than exact equality of the interface labels and report titles, connects uploaded chapters to their stages.</w:t>
+        <w:t>Figure 4.3(a) displays the successful topic-submission message, which states that the supervisor and project partners have been notified. Figure 4.3(b) shows the resulting student project summary: the topic is Pending, progress is initially 0 per cent, the supervisor is identified, and the health badge is On Track. These values describe the initial state of that example. A pending topic is compatible with an On Track badge because topic approval and project-health classification represent different conditions.</w:t>
+      </w:r>
+    </w:p>
+    <w:p>
+      <w:pPr>
+        <w:keepNext/>
+        <w:widowControl/>
+        <w:spacing w:after="140" w:line="360" w:lineRule="auto"/>
+        <w:ind w:firstLine="0"/>
+        <w:jc w:val="center"/>
+      </w:pPr>
+      <w:r>
+        <w:rPr>
+          <w:color w:val="222222"/>
+        </w:rPr>
+      </w:r>
+      <w:r>
+        <w:drawing>
+          <wp:inline xmlns:a="http://schemas.openxmlformats.org/drawingml/2006/main" xmlns:pic="http://schemas.openxmlformats.org/drawingml/2006/picture">
+            <wp:extent cx="5394960" cy="3128301"/>
+            <wp:docPr id="11" name="Picture 11"/>
+            <wp:cNvGraphicFramePr>
+              <a:graphicFrameLocks noChangeAspect="1"/>
+            </wp:cNvGraphicFramePr>
+            <a:graphic>
+              <a:graphicData uri="http://schemas.openxmlformats.org/drawingml/2006/picture">
+                <pic:pic>
+                  <pic:nvPicPr>
+                    <pic:cNvPr id="0" name="09-submission-confirmation.jpg"/>
+                    <pic:cNvPicPr/>
+                  </pic:nvPicPr>
+                  <pic:blipFill>
+                    <a:blip r:embed="rId20"/>
+                    <a:stretch>
+                      <a:fillRect/>
+                    </a:stretch>
+                  </pic:blipFill>
+                  <pic:spPr>
+                    <a:xfrm>
+                      <a:off x="0" y="0"/>
+                      <a:ext cx="5394960" cy="3128301"/>
+                    </a:xfrm>
+                    <a:prstGeom prst="rect"/>
+                  </pic:spPr>
+                </pic:pic>
+              </a:graphicData>
+            </a:graphic>
+          </wp:inline>
+        </w:drawing>
+      </w:r>
+    </w:p>
+    <w:p>
+      <w:pPr>
+        <w:keepNext/>
+        <w:spacing w:before="40" w:after="200"/>
+        <w:jc w:val="center"/>
+      </w:pPr>
+      <w:r>
+        <w:rPr>
+          <w:i/>
+          <w:color w:val="45586D"/>
+        </w:rPr>
+        <w:t>(a) Successful topic-submission confirmation.</w:t>
+      </w:r>
+    </w:p>
+    <w:p>
+      <w:pPr>
+        <w:keepNext/>
+        <w:widowControl/>
+        <w:spacing w:after="140" w:line="360" w:lineRule="auto"/>
+        <w:ind w:firstLine="0"/>
+        <w:jc w:val="center"/>
+      </w:pPr>
+      <w:r>
+        <w:rPr>
+          <w:color w:val="222222"/>
+        </w:rPr>
+      </w:r>
+      <w:r>
+        <w:drawing>
+          <wp:inline xmlns:a="http://schemas.openxmlformats.org/drawingml/2006/main" xmlns:pic="http://schemas.openxmlformats.org/drawingml/2006/picture">
+            <wp:extent cx="5394960" cy="3034665"/>
+            <wp:docPr id="12" name="Picture 12"/>
+            <wp:cNvGraphicFramePr>
+              <a:graphicFrameLocks noChangeAspect="1"/>
+            </wp:cNvGraphicFramePr>
+            <a:graphic>
+              <a:graphicData uri="http://schemas.openxmlformats.org/drawingml/2006/picture">
+                <pic:pic>
+                  <pic:nvPicPr>
+                    <pic:cNvPr id="0" name="05-student-pending-dashboard.jpg"/>
+                    <pic:cNvPicPr/>
+                  </pic:nvPicPr>
+                  <pic:blipFill>
+                    <a:blip r:embed="rId21"/>
+                    <a:stretch>
+                      <a:fillRect/>
+                    </a:stretch>
+                  </pic:blipFill>
+                  <pic:spPr>
+                    <a:xfrm>
+                      <a:off x="0" y="0"/>
+                      <a:ext cx="5394960" cy="3034665"/>
+                    </a:xfrm>
+                    <a:prstGeom prst="rect"/>
+                  </pic:spPr>
+                </pic:pic>
+              </a:graphicData>
+            </a:graphic>
+          </wp:inline>
+        </w:drawing>
+      </w:r>
+    </w:p>
+    <w:p>
+      <w:pPr>
+        <w:keepNext/>
+        <w:spacing w:before="40" w:after="200"/>
+        <w:jc w:val="center"/>
+      </w:pPr>
+      <w:r>
+        <w:rPr>
+          <w:i/>
+          <w:color w:val="45586D"/>
+        </w:rPr>
+        <w:t>(b) Pending topic, initial progress and project summary.</w:t>
+      </w:r>
+    </w:p>
+    <w:p>
+      <w:pPr>
+        <w:spacing w:before="40" w:after="200"/>
+        <w:jc w:val="center"/>
+      </w:pPr>
+      <w:r>
+        <w:rPr>
+          <w:i/>
+          <w:color w:val="45586D"/>
+        </w:rPr>
+        <w:t>Figure 4.3: Topic-Submission Confirmation and the Student Project Dashboard</w:t>
       </w:r>
     </w:p>
     <w:p>
@@ -10014,70 +10348,7 @@
         <w:rPr>
           <w:color w:val="222222"/>
         </w:rPr>
-        <w:t>The submission form records the document title, kind and chapter number and selects the file to upload. The client permits PDF, Word, PNG and JPEG files up to 25 MB. It first obtains a signed upload URL, sends the bytes to private storage with an upload-progress indicator, and then registers the metadata through the project submission endpoint. A visible upload percentage is not the same as completed metadata registration; the user should confirm that the submission appears in the project list. The record retains a project-level version number, file path, submitting user, status and timestamps.</w:t>
-      </w:r>
-    </w:p>
-    <w:p>
-      <w:pPr>
-        <w:widowControl/>
-        <w:spacing w:after="140" w:line="360" w:lineRule="auto"/>
-        <w:ind w:firstLine="648"/>
-        <w:jc w:val="both"/>
-      </w:pPr>
-      <w:r>
-        <w:rPr>
-          <w:color w:val="222222"/>
-        </w:rPr>
-        <w:t>The supervisor review workspace supports Pending review, Changes requested and Approved states, written feedback, and an optional grade from 0 to 100. The first supervisor response timestamp supports responsiveness calculations. Submission-scoped comment forms allow authorised project participants to discuss that particular file, rather than attaching all corrections to one undifferentiated project thread. Review decisions notify the project students and create activity entries. Figure 4.4 should show the chapter breakdown and a saved review with a grade and meaningful feedback.</w:t>
-      </w:r>
-    </w:p>
-    <w:p>
-      <w:pPr>
-        <w:keepNext/>
-        <w:keepLines/>
-        <w:widowControl/>
-        <w:spacing w:after="160" w:line="240" w:lineRule="auto" w:before="200"/>
-        <w:ind w:firstLine="0" w:left="288" w:right="288"/>
-        <w:jc w:val="center"/>
-        <w:pBdr>
-          <w:top w:val="single" w:sz="4" w:color="B0B0B0" w:space="8"/>
-          <w:left w:val="single" w:sz="4" w:color="B0B0B0" w:space="8"/>
-          <w:bottom w:val="single" w:sz="4" w:color="B0B0B0" w:space="8"/>
-          <w:right w:val="single" w:sz="4" w:color="B0B0B0" w:space="8"/>
-        </w:pBdr>
-      </w:pPr>
-      <w:r>
-        <w:rPr>
-          <w:color w:val="222222"/>
-        </w:rPr>
-        <w:t>[Figure 4.4 screenshot to be inserted: Capture the stage breakdown after one chapter approval and a saved review containing feedback and a grade.]</w:t>
-      </w:r>
-    </w:p>
-    <w:p>
-      <w:pPr>
-        <w:spacing w:before="40" w:after="200"/>
-        <w:jc w:val="center"/>
-      </w:pPr>
-      <w:r>
-        <w:rPr>
-          <w:i/>
-          <w:color w:val="45586D"/>
-        </w:rPr>
-        <w:t>Figure 4.4: Chapter Progress and Submission Review with Feedback and Grade</w:t>
-      </w:r>
-    </w:p>
-    <w:p>
-      <w:pPr>
-        <w:widowControl/>
-        <w:spacing w:after="140" w:line="360" w:lineRule="auto"/>
-        <w:ind w:firstLine="648"/>
-        <w:jc w:val="both"/>
-      </w:pPr>
-      <w:r>
-        <w:rPr>
-          <w:color w:val="222222"/>
-        </w:rPr>
-        <w:t>Submitting a revision creates a new record and returns the selected chapter to In review. The project retains the latest submission reference for each chapter, so an older review cannot overwrite the newer stage. Progress is computed from currently approved stages, not from the number of files uploaded. Therefore, replacing an approved stage with a new submission can reduce its counted progress until approval is restored. The server rejects invalid grades and prevents students from setting review decisions or fabricating progress.</w:t>
+        <w:t>The project dashboard presents the current topic decision, the progress bar, supervisor information, defence date when recorded, and open-ticket count. It links to the shared project workspace, where the student can follow chapter states and supervision decisions. The notification feed and activity log provide related but distinct views: notifications draw a recipient’s attention to an event, while the activity log preserves its project context, actor and timestamp.</w:t>
       </w:r>
     </w:p>
     <w:p>
@@ -10092,7 +10363,7 @@
           <w:b/>
           <w:color w:val="000000"/>
         </w:rPr>
-        <w:t>4.2.4 Tickets, Activity and Deadline Extensions</w:t>
+        <w:t>4.2.4 Chapter Breakdown, Activity History and Extensions</w:t>
       </w:r>
     </w:p>
     <w:p>
@@ -10106,7 +10377,82 @@
         <w:rPr>
           <w:color w:val="222222"/>
         </w:rPr>
-        <w:t>Students and supervisors can create project tickets to record a question or task, select a priority, and use Open, In progress, Blocked or Done states. Tickets support the supervision record but are not weighted chapter milestones. The activity panel displays topic, submission, review and extension events with actors and timestamps, making the transition from Pending to Approved or Declined retrievable. Ticket and submission/comment counts also support dashboard summaries and activity charts.</w:t>
+        <w:t>Figure 4.4 presents the stage-by-stage chapter breakdown, deadline-extension interface and project activity history. The five stored stages are Introduction; Literature Review; Methodology; System Design and Implementation; and Summary, Conclusion and Recommendations. The report retains the corrected academic chapter titles; chapter numbers map submitted documents to these application stages even where the interface label is phrased differently.</w:t>
+      </w:r>
+    </w:p>
+    <w:p>
+      <w:pPr>
+        <w:keepNext/>
+        <w:widowControl/>
+        <w:spacing w:after="140" w:line="360" w:lineRule="auto"/>
+        <w:ind w:firstLine="0"/>
+        <w:jc w:val="center"/>
+      </w:pPr>
+      <w:r>
+        <w:rPr>
+          <w:color w:val="222222"/>
+        </w:rPr>
+      </w:r>
+      <w:r>
+        <w:drawing>
+          <wp:inline xmlns:a="http://schemas.openxmlformats.org/drawingml/2006/main" xmlns:pic="http://schemas.openxmlformats.org/drawingml/2006/picture">
+            <wp:extent cx="5394960" cy="3034665"/>
+            <wp:docPr id="13" name="Picture 13"/>
+            <wp:cNvGraphicFramePr>
+              <a:graphicFrameLocks noChangeAspect="1"/>
+            </wp:cNvGraphicFramePr>
+            <a:graphic>
+              <a:graphicData uri="http://schemas.openxmlformats.org/drawingml/2006/picture">
+                <pic:pic>
+                  <pic:nvPicPr>
+                    <pic:cNvPr id="0" name="07-extension-activity-history.jpg"/>
+                    <pic:cNvPicPr/>
+                  </pic:nvPicPr>
+                  <pic:blipFill>
+                    <a:blip r:embed="rId22"/>
+                    <a:stretch>
+                      <a:fillRect/>
+                    </a:stretch>
+                  </pic:blipFill>
+                  <pic:spPr>
+                    <a:xfrm>
+                      <a:off x="0" y="0"/>
+                      <a:ext cx="5394960" cy="3034665"/>
+                    </a:xfrm>
+                    <a:prstGeom prst="rect"/>
+                  </pic:spPr>
+                </pic:pic>
+              </a:graphicData>
+            </a:graphic>
+          </wp:inline>
+        </w:drawing>
+      </w:r>
+    </w:p>
+    <w:p>
+      <w:pPr>
+        <w:keepNext/>
+        <w:spacing w:before="40" w:after="200"/>
+        <w:jc w:val="center"/>
+      </w:pPr>
+      <w:r>
+        <w:rPr>
+          <w:i/>
+          <w:color w:val="45586D"/>
+        </w:rPr>
+        <w:t>Chapter states, deadline-extension controls and timestamped project activity.</w:t>
+      </w:r>
+    </w:p>
+    <w:p>
+      <w:pPr>
+        <w:spacing w:before="40" w:after="200"/>
+        <w:jc w:val="center"/>
+      </w:pPr>
+      <w:r>
+        <w:rPr>
+          <w:i/>
+          <w:color w:val="45586D"/>
+        </w:rPr>
+        <w:t>Figure 4.4: Chapter Stages, Deadline Extension and Project Activity History</w:t>
       </w:r>
     </w:p>
     <w:p>
@@ -10120,42 +10466,21 @@
         <w:rPr>
           <w:color w:val="222222"/>
         </w:rPr>
-        <w:t>A project student can request a later deadline date. Validation requires a real calendar date later than the current deadline, or later than the current time when no deadline exists, and within the implemented 180-day request horizon. A second request cannot replace an already pending request. The supervisor can grant or decline it with an optional note. Approval updates nextDeadline to the requested date; decline leaves that deadline unchanged. An extension does not automatically move defenseDate, which is stored separately. Notifications and activity entries make the decision visible to the project members. Figure 4.5 should show the decision controls and the persisted result.</w:t>
-      </w:r>
-    </w:p>
-    <w:p>
-      <w:pPr>
-        <w:keepNext/>
-        <w:keepLines/>
+        <w:t>A chapter is Not started before submission, In review after submission, Changes requested when corrections are required, and Approved after the supervisor approves its current version. Each approved stage contributes 20 per cent to project progress. The screenshots show a newly submitted topic with chapter work not yet started and an activity entry for topic submission. They illustrate the initial workflow layout rather than a completed-project result.</w:t>
+      </w:r>
+    </w:p>
+    <w:p>
+      <w:pPr>
         <w:widowControl/>
-        <w:spacing w:after="160" w:line="240" w:lineRule="auto" w:before="200"/>
-        <w:ind w:firstLine="0" w:left="288" w:right="288"/>
-        <w:jc w:val="center"/>
-        <w:pBdr>
-          <w:top w:val="single" w:sz="4" w:color="B0B0B0" w:space="8"/>
-          <w:left w:val="single" w:sz="4" w:color="B0B0B0" w:space="8"/>
-          <w:bottom w:val="single" w:sz="4" w:color="B0B0B0" w:space="8"/>
-          <w:right w:val="single" w:sz="4" w:color="B0B0B0" w:space="8"/>
-        </w:pBdr>
+        <w:spacing w:after="140" w:line="360" w:lineRule="auto"/>
+        <w:ind w:firstLine="648"/>
+        <w:jc w:val="both"/>
       </w:pPr>
       <w:r>
         <w:rPr>
           <w:color w:val="222222"/>
         </w:rPr>
-        <w:t>[Figure 4.5 screenshot to be inserted: Capture a pending extension with grant/decline controls and the student record after the decision.]</w:t>
-      </w:r>
-    </w:p>
-    <w:p>
-      <w:pPr>
-        <w:spacing w:before="40" w:after="200"/>
-        <w:jc w:val="center"/>
-      </w:pPr>
-      <w:r>
-        <w:rPr>
-          <w:i/>
-          <w:color w:val="45586D"/>
-        </w:rPr>
-        <w:t>Figure 4.5: Deadline-Extension Request, Supervisor Decision and Activity Record</w:t>
+        <w:t>The extension form lets a project student propose a later deadline. Validation checks a real date later than the current deadline and within the implemented request horizon; an existing Pending request cannot be replaced by another request. The assigned supervisor grants or declines the request with an optional note. Approval changes nextDeadline, while decline preserves it. The defence date is maintained separately. Decision notifications and activity records make the outcome visible to the project members.</w:t>
       </w:r>
     </w:p>
     <w:p>
@@ -10170,7 +10495,7 @@
           <w:b/>
           <w:color w:val="000000"/>
         </w:rPr>
-        <w:t>4.2.5 Final Submission, Final Approval and Defence Date</w:t>
+        <w:t>4.2.5 Supervisor Dashboard and Topic Decisions</w:t>
       </w:r>
     </w:p>
     <w:p>
@@ -10184,7 +10509,144 @@
         <w:rPr>
           <w:color w:val="222222"/>
         </w:rPr>
-        <w:t>All five chapter states must be Approved before a final submission is accepted. The same condition is checked when the supervisor grants final approval. This prevents an empty or partially populated chapter array, or a direct status change, from bypassing the final gate. Approving the final submission records finalApproved = true, changes the lifecycle status to Approved, preserves 100 per cent chapter progress, adjusts relevant dashboard counters and notifies the team. Ordinary chapter changes are blocked while final approval is active. The final review can be returned to a non-approved state by the assigned supervisor before further chapter work resumes.</w:t>
+        <w:t>Figure 4.5(a) shows the supervisor dashboard before project activity, with zero workload counters and no recorded average response. The dashboard summarises active projects, overdue or warning items, pending reviews, open tickets and project-health counts. Figure 4.5(b) shows the topic-decision workspace: the assigned supervisor can Approve topic, Decline or Mark pending, and can enter decision feedback.</w:t>
+      </w:r>
+    </w:p>
+    <w:p>
+      <w:pPr>
+        <w:keepNext/>
+        <w:widowControl/>
+        <w:spacing w:after="140" w:line="360" w:lineRule="auto"/>
+        <w:ind w:firstLine="0"/>
+        <w:jc w:val="center"/>
+      </w:pPr>
+      <w:r>
+        <w:rPr>
+          <w:color w:val="222222"/>
+        </w:rPr>
+      </w:r>
+      <w:r>
+        <w:drawing>
+          <wp:inline xmlns:a="http://schemas.openxmlformats.org/drawingml/2006/main" xmlns:pic="http://schemas.openxmlformats.org/drawingml/2006/picture">
+            <wp:extent cx="5394960" cy="3034665"/>
+            <wp:docPr id="14" name="Picture 14"/>
+            <wp:cNvGraphicFramePr>
+              <a:graphicFrameLocks noChangeAspect="1"/>
+            </wp:cNvGraphicFramePr>
+            <a:graphic>
+              <a:graphicData uri="http://schemas.openxmlformats.org/drawingml/2006/picture">
+                <pic:pic>
+                  <pic:nvPicPr>
+                    <pic:cNvPr id="0" name="08-supervisor-dashboard.jpg"/>
+                    <pic:cNvPicPr/>
+                  </pic:nvPicPr>
+                  <pic:blipFill>
+                    <a:blip r:embed="rId23"/>
+                    <a:stretch>
+                      <a:fillRect/>
+                    </a:stretch>
+                  </pic:blipFill>
+                  <pic:spPr>
+                    <a:xfrm>
+                      <a:off x="0" y="0"/>
+                      <a:ext cx="5394960" cy="3034665"/>
+                    </a:xfrm>
+                    <a:prstGeom prst="rect"/>
+                  </pic:spPr>
+                </pic:pic>
+              </a:graphicData>
+            </a:graphic>
+          </wp:inline>
+        </w:drawing>
+      </w:r>
+    </w:p>
+    <w:p>
+      <w:pPr>
+        <w:keepNext/>
+        <w:spacing w:before="40" w:after="200"/>
+        <w:jc w:val="center"/>
+      </w:pPr>
+      <w:r>
+        <w:rPr>
+          <w:i/>
+          <w:color w:val="45586D"/>
+        </w:rPr>
+        <w:t>(a) Supervisor workload summary before project activity.</w:t>
+      </w:r>
+    </w:p>
+    <w:p>
+      <w:pPr>
+        <w:keepNext/>
+        <w:widowControl/>
+        <w:spacing w:after="140" w:line="360" w:lineRule="auto"/>
+        <w:ind w:firstLine="0"/>
+        <w:jc w:val="center"/>
+      </w:pPr>
+      <w:r>
+        <w:rPr>
+          <w:color w:val="222222"/>
+        </w:rPr>
+      </w:r>
+      <w:r>
+        <w:drawing>
+          <wp:inline xmlns:a="http://schemas.openxmlformats.org/drawingml/2006/main" xmlns:pic="http://schemas.openxmlformats.org/drawingml/2006/picture">
+            <wp:extent cx="5394960" cy="3034665"/>
+            <wp:docPr id="15" name="Picture 15"/>
+            <wp:cNvGraphicFramePr>
+              <a:graphicFrameLocks noChangeAspect="1"/>
+            </wp:cNvGraphicFramePr>
+            <a:graphic>
+              <a:graphicData uri="http://schemas.openxmlformats.org/drawingml/2006/picture">
+                <pic:pic>
+                  <pic:nvPicPr>
+                    <pic:cNvPr id="0" name="10-supervisor-topic-controls.jpg"/>
+                    <pic:cNvPicPr/>
+                  </pic:nvPicPr>
+                  <pic:blipFill>
+                    <a:blip r:embed="rId24"/>
+                    <a:stretch>
+                      <a:fillRect/>
+                    </a:stretch>
+                  </pic:blipFill>
+                  <pic:spPr>
+                    <a:xfrm>
+                      <a:off x="0" y="0"/>
+                      <a:ext cx="5394960" cy="3034665"/>
+                    </a:xfrm>
+                    <a:prstGeom prst="rect"/>
+                  </pic:spPr>
+                </pic:pic>
+              </a:graphicData>
+            </a:graphic>
+          </wp:inline>
+        </w:drawing>
+      </w:r>
+    </w:p>
+    <w:p>
+      <w:pPr>
+        <w:keepNext/>
+        <w:spacing w:before="40" w:after="200"/>
+        <w:jc w:val="center"/>
+      </w:pPr>
+      <w:r>
+        <w:rPr>
+          <w:i/>
+          <w:color w:val="45586D"/>
+        </w:rPr>
+        <w:t>(b) Pending topic with approval, decline and pending controls.</w:t>
+      </w:r>
+    </w:p>
+    <w:p>
+      <w:pPr>
+        <w:spacing w:before="40" w:after="200"/>
+        <w:jc w:val="center"/>
+      </w:pPr>
+      <w:r>
+        <w:rPr>
+          <w:i/>
+          <w:color w:val="45586D"/>
+        </w:rPr>
+        <w:t>Figure 4.5: Supervisor Dashboard and Topic-Decision Controls</w:t>
       </w:r>
     </w:p>
     <w:p>
@@ -10198,42 +10660,7 @@
         <w:rPr>
           <w:color w:val="222222"/>
         </w:rPr>
-        <w:t>The supervisor can record the next deadline and a defence date. Students and the department HOD see the same stored project dates through their authorised views. The health rules use the defence date as a schedule signal; the application does not allocate examiners, conduct the defence, record a defence result or issue a certificate. Figure 4.6 should show all five approved stages, the explicit final-approval message and the scheduled defence date. It demonstrates documented project clearance and date tracking, not an unimplemented defence-result screen.</w:t>
-      </w:r>
-    </w:p>
-    <w:p>
-      <w:pPr>
-        <w:keepNext/>
-        <w:keepLines/>
-        <w:widowControl/>
-        <w:spacing w:after="160" w:line="240" w:lineRule="auto" w:before="200"/>
-        <w:ind w:firstLine="0" w:left="288" w:right="288"/>
-        <w:jc w:val="center"/>
-        <w:pBdr>
-          <w:top w:val="single" w:sz="4" w:color="B0B0B0" w:space="8"/>
-          <w:left w:val="single" w:sz="4" w:color="B0B0B0" w:space="8"/>
-          <w:bottom w:val="single" w:sz="4" w:color="B0B0B0" w:space="8"/>
-          <w:right w:val="single" w:sz="4" w:color="B0B0B0" w:space="8"/>
-        </w:pBdr>
-      </w:pPr>
-      <w:r>
-        <w:rPr>
-          <w:color w:val="222222"/>
-        </w:rPr>
-        <w:t>[Figure 4.6 screenshot to be inserted: Capture the completed chapter states and explicit final approval, with the project’s scheduled defence date.]</w:t>
-      </w:r>
-    </w:p>
-    <w:p>
-      <w:pPr>
-        <w:spacing w:before="40" w:after="200"/>
-        <w:jc w:val="center"/>
-      </w:pPr>
-      <w:r>
-        <w:rPr>
-          <w:i/>
-          <w:color w:val="45586D"/>
-        </w:rPr>
-        <w:t>Figure 4.6: Five Approved Chapters, Final Project Approval and Scheduled Defence Date</w:t>
+        <w:t>A declined topic may be revised and resubmitted by the lead student, returning it to Pending for review. Chapter work remains blocked until topic approval, although proposal files can be submitted during topic consideration. The decision, note, actor and timestamp are retained in the project record and activity history. Project members receive the relevant decision notification.</w:t>
       </w:r>
     </w:p>
     <w:p>
@@ -10248,7 +10675,7 @@
           <w:b/>
           <w:color w:val="000000"/>
         </w:rPr>
-        <w:t>4.2.6 Supervisor and Departmental Monitoring</w:t>
+        <w:t>4.2.6 Project Review, Feedback, Grades and Defence Scheduling</w:t>
       </w:r>
     </w:p>
     <w:p>
@@ -10262,33 +10689,60 @@
         <w:rPr>
           <w:color w:val="222222"/>
         </w:rPr>
-        <w:t>The supervisor dashboard summarises active projects, pending submissions, open tickets and health classifications. Project lists and the roster use student matriculation numbers, while project views display the team. The HOD dashboard and associated views present department-scoped project and supervisor summaries, a health-status distribution, daily activity and supervisor responsiveness. The response metric is based on recorded submission and first-response timestamps; where no measured response exists, the interface should not invent a turnaround value. Figure 4.7 should show meaningful, synthetic activity data and readable chart labels.</w:t>
+        <w:t>Figure 4.6 shows the supervisor project overview and its Overview, Tickets, Submissions and Feedback navigation. The captured record identifies a student by matriculation number and displays the team association, progress, open-ticket count and defence-date entry control. Matriculation identity is used in lecturer-facing project and roster views instead of presenting a student email as the principal identifier.</w:t>
       </w:r>
     </w:p>
     <w:p>
       <w:pPr>
         <w:keepNext/>
-        <w:keepLines/>
         <w:widowControl/>
-        <w:spacing w:after="160" w:line="240" w:lineRule="auto" w:before="200"/>
-        <w:ind w:firstLine="0" w:left="288" w:right="288"/>
+        <w:spacing w:after="140" w:line="360" w:lineRule="auto"/>
+        <w:ind w:firstLine="0"/>
         <w:jc w:val="center"/>
-        <w:pBdr>
-          <w:top w:val="single" w:sz="4" w:color="B0B0B0" w:space="8"/>
-          <w:left w:val="single" w:sz="4" w:color="B0B0B0" w:space="8"/>
-          <w:bottom w:val="single" w:sz="4" w:color="B0B0B0" w:space="8"/>
-          <w:right w:val="single" w:sz="4" w:color="B0B0B0" w:space="8"/>
-        </w:pBdr>
       </w:pPr>
       <w:r>
         <w:rPr>
           <w:color w:val="222222"/>
         </w:rPr>
-        <w:t>[Figure 4.7 screenshot to be inserted: Capture the departmental dashboard with readable project-health and activity/response summaries.]</w:t>
-      </w:r>
-    </w:p>
-    <w:p>
-      <w:pPr>
+      </w:r>
+      <w:r>
+        <w:drawing>
+          <wp:inline xmlns:a="http://schemas.openxmlformats.org/drawingml/2006/main" xmlns:pic="http://schemas.openxmlformats.org/drawingml/2006/picture">
+            <wp:extent cx="5394960" cy="3034665"/>
+            <wp:docPr id="16" name="Picture 16"/>
+            <wp:cNvGraphicFramePr>
+              <a:graphicFrameLocks noChangeAspect="1"/>
+            </wp:cNvGraphicFramePr>
+            <a:graphic>
+              <a:graphicData uri="http://schemas.openxmlformats.org/drawingml/2006/picture">
+                <pic:pic>
+                  <pic:nvPicPr>
+                    <pic:cNvPr id="0" name="11-supervisor-project-overview.jpg"/>
+                    <pic:cNvPicPr/>
+                  </pic:nvPicPr>
+                  <pic:blipFill>
+                    <a:blip r:embed="rId25"/>
+                    <a:stretch>
+                      <a:fillRect/>
+                    </a:stretch>
+                  </pic:blipFill>
+                  <pic:spPr>
+                    <a:xfrm>
+                      <a:off x="0" y="0"/>
+                      <a:ext cx="5394960" cy="3034665"/>
+                    </a:xfrm>
+                    <a:prstGeom prst="rect"/>
+                  </pic:spPr>
+                </pic:pic>
+              </a:graphicData>
+            </a:graphic>
+          </wp:inline>
+        </w:drawing>
+      </w:r>
+    </w:p>
+    <w:p>
+      <w:pPr>
+        <w:keepNext/>
         <w:spacing w:before="40" w:after="200"/>
         <w:jc w:val="center"/>
       </w:pPr>
@@ -10297,7 +10751,62 @@
           <w:i/>
           <w:color w:val="45586D"/>
         </w:rPr>
-        <w:t>Figure 4.7: HOD Departmental Project-Health and Supervision-Activity Overview</w:t>
+        <w:t>Project overview showing matriculation identity, team, navigation tabs and defence-date entry.</w:t>
+      </w:r>
+    </w:p>
+    <w:p>
+      <w:pPr>
+        <w:spacing w:before="40" w:after="200"/>
+        <w:jc w:val="center"/>
+      </w:pPr>
+      <w:r>
+        <w:rPr>
+          <w:i/>
+          <w:color w:val="45586D"/>
+        </w:rPr>
+        <w:t>Figure 4.6: Supervisor Project Overview, Student Identity and Defence-Date Control</w:t>
+      </w:r>
+    </w:p>
+    <w:p>
+      <w:pPr>
+        <w:widowControl/>
+        <w:spacing w:after="140" w:line="360" w:lineRule="auto"/>
+        <w:ind w:firstLine="648"/>
+        <w:jc w:val="both"/>
+      </w:pPr>
+      <w:r>
+        <w:rPr>
+          <w:color w:val="222222"/>
+        </w:rPr>
+        <w:t>The submission workspace accepts PDF, Word, PNG and JPEG documents up to 25 MB. The browser first obtains authorised signed upload access, transfers the file to the private storage bucket and registers its metadata. A record retains the title, kind, chapter number where applicable, version, submitting user, file reference, review state and timestamps. Version records preserve earlier documents, while the latest-chapter reference identifies the version controlling the current stage.</w:t>
+      </w:r>
+    </w:p>
+    <w:p>
+      <w:pPr>
+        <w:widowControl/>
+        <w:spacing w:after="140" w:line="360" w:lineRule="auto"/>
+        <w:ind w:firstLine="648"/>
+        <w:jc w:val="both"/>
+      </w:pPr>
+      <w:r>
+        <w:rPr>
+          <w:color w:val="222222"/>
+        </w:rPr>
+        <w:t>The assigned supervisor saves a review outcome, written feedback and an optional grade from 0 to 100. Submission-scoped comments support further discussion between authorised participants. A revision creates a new submission and returns its selected stage to review; an older review cannot overwrite a newer chapter stage. Review decisions update the activity history, notify the project members and maintain the associated counters.</w:t>
+      </w:r>
+    </w:p>
+    <w:p>
+      <w:pPr>
+        <w:widowControl/>
+        <w:spacing w:after="140" w:line="360" w:lineRule="auto"/>
+        <w:ind w:firstLine="648"/>
+        <w:jc w:val="both"/>
+      </w:pPr>
+      <w:r>
+        <w:rPr>
+          <w:color w:val="222222"/>
+        </w:rPr>
+        <w:t>The supervisor can set the next deadline and the defence date as distinct project fields. All five chapters must be approved before a final submission is accepted, and the same condition is enforced for final approval. The supervisor’s approval of the final document records the project’s explicit clearance state. The system supports defence-date tracking; examiner allocation, panel management, defence results and certification remain outside its defined scope.</w:t>
       </w:r>
     </w:p>
     <w:p>
@@ -10312,7 +10821,7 @@
           <w:b/>
           <w:color w:val="000000"/>
         </w:rPr>
-        <w:t>4.2.7 Mobile Presentation and Logout</w:t>
+        <w:t>4.2.7 HOD Dashboard and Departmental Project Overview</w:t>
       </w:r>
     </w:p>
     <w:p>
@@ -10326,7 +10835,144 @@
         <w:rPr>
           <w:color w:val="222222"/>
         </w:rPr>
-        <w:t>The interface uses locally bundled Roboto with YABATECH green and yellow. Responsive layouts allow controls to wrap, tables to scroll inside their containers where necessary, and phone forms to retain legible input text. The mobile landing header places branding and account actions on separate rows at narrow widths, preventing the dashboard button from overlapping the project title. These interface choices concern the application; the report retains the corrected document’s Times New Roman font and academic layout.</w:t>
+        <w:t>Figure 4.7(a) illustrates the HOD dashboard for Computer Science. In the captured state it displays eight supervisors, nine active projects, six overdue items and a department average response of 36.1 hours. These are the values displayed for that demonstration dataset at capture time, not a measured before-and-after improvement in departmental supervision. The activity chart presents submission, comment and ticket series, while the supervisor table supports follow-up at staff level.</w:t>
+      </w:r>
+    </w:p>
+    <w:p>
+      <w:pPr>
+        <w:keepNext/>
+        <w:widowControl/>
+        <w:spacing w:after="140" w:line="360" w:lineRule="auto"/>
+        <w:ind w:firstLine="0"/>
+        <w:jc w:val="center"/>
+      </w:pPr>
+      <w:r>
+        <w:rPr>
+          <w:color w:val="222222"/>
+        </w:rPr>
+      </w:r>
+      <w:r>
+        <w:drawing>
+          <wp:inline xmlns:a="http://schemas.openxmlformats.org/drawingml/2006/main" xmlns:pic="http://schemas.openxmlformats.org/drawingml/2006/picture">
+            <wp:extent cx="5394960" cy="3034665"/>
+            <wp:docPr id="17" name="Picture 17"/>
+            <wp:cNvGraphicFramePr>
+              <a:graphicFrameLocks noChangeAspect="1"/>
+            </wp:cNvGraphicFramePr>
+            <a:graphic>
+              <a:graphicData uri="http://schemas.openxmlformats.org/drawingml/2006/picture">
+                <pic:pic>
+                  <pic:nvPicPr>
+                    <pic:cNvPr id="0" name="12-hod-activity-dashboard.jpg"/>
+                    <pic:cNvPicPr/>
+                  </pic:nvPicPr>
+                  <pic:blipFill>
+                    <a:blip r:embed="rId26"/>
+                    <a:stretch>
+                      <a:fillRect/>
+                    </a:stretch>
+                  </pic:blipFill>
+                  <pic:spPr>
+                    <a:xfrm>
+                      <a:off x="0" y="0"/>
+                      <a:ext cx="5394960" cy="3034665"/>
+                    </a:xfrm>
+                    <a:prstGeom prst="rect"/>
+                  </pic:spPr>
+                </pic:pic>
+              </a:graphicData>
+            </a:graphic>
+          </wp:inline>
+        </w:drawing>
+      </w:r>
+    </w:p>
+    <w:p>
+      <w:pPr>
+        <w:keepNext/>
+        <w:spacing w:before="40" w:after="200"/>
+        <w:jc w:val="center"/>
+      </w:pPr>
+      <w:r>
+        <w:rPr>
+          <w:i/>
+          <w:color w:val="45586D"/>
+        </w:rPr>
+        <w:t>(a) Departmental counters, response metric and supervision-activity chart.</w:t>
+      </w:r>
+    </w:p>
+    <w:p>
+      <w:pPr>
+        <w:keepNext/>
+        <w:widowControl/>
+        <w:spacing w:after="140" w:line="360" w:lineRule="auto"/>
+        <w:ind w:firstLine="0"/>
+        <w:jc w:val="center"/>
+      </w:pPr>
+      <w:r>
+        <w:rPr>
+          <w:color w:val="222222"/>
+        </w:rPr>
+      </w:r>
+      <w:r>
+        <w:drawing>
+          <wp:inline xmlns:a="http://schemas.openxmlformats.org/drawingml/2006/main" xmlns:pic="http://schemas.openxmlformats.org/drawingml/2006/picture">
+            <wp:extent cx="5394960" cy="3034665"/>
+            <wp:docPr id="18" name="Picture 18"/>
+            <wp:cNvGraphicFramePr>
+              <a:graphicFrameLocks noChangeAspect="1"/>
+            </wp:cNvGraphicFramePr>
+            <a:graphic>
+              <a:graphicData uri="http://schemas.openxmlformats.org/drawingml/2006/picture">
+                <pic:pic>
+                  <pic:nvPicPr>
+                    <pic:cNvPr id="0" name="13-hod-project-overview.jpg"/>
+                    <pic:cNvPicPr/>
+                  </pic:nvPicPr>
+                  <pic:blipFill>
+                    <a:blip r:embed="rId27"/>
+                    <a:stretch>
+                      <a:fillRect/>
+                    </a:stretch>
+                  </pic:blipFill>
+                  <pic:spPr>
+                    <a:xfrm>
+                      <a:off x="0" y="0"/>
+                      <a:ext cx="5394960" cy="3034665"/>
+                    </a:xfrm>
+                    <a:prstGeom prst="rect"/>
+                  </pic:spPr>
+                </pic:pic>
+              </a:graphicData>
+            </a:graphic>
+          </wp:inline>
+        </w:drawing>
+      </w:r>
+    </w:p>
+    <w:p>
+      <w:pPr>
+        <w:keepNext/>
+        <w:spacing w:before="40" w:after="200"/>
+        <w:jc w:val="center"/>
+      </w:pPr>
+      <w:r>
+        <w:rPr>
+          <w:i/>
+          <w:color w:val="45586D"/>
+        </w:rPr>
+        <w:t>(b) Department projects with progress and health classifications.</w:t>
+      </w:r>
+    </w:p>
+    <w:p>
+      <w:pPr>
+        <w:spacing w:before="40" w:after="200"/>
+        <w:jc w:val="center"/>
+      </w:pPr>
+      <w:r>
+        <w:rPr>
+          <w:i/>
+          <w:color w:val="45586D"/>
+        </w:rPr>
+        <w:t>Figure 4.7: HOD Activity Dashboard and Departmental Project-Health Overview</w:t>
       </w:r>
     </w:p>
     <w:p>
@@ -10340,33 +10986,89 @@
         <w:rPr>
           <w:color w:val="222222"/>
         </w:rPr>
-        <w:t>Logout clears both forms of authentication state: Firebase client sign-in and the HttpOnly server session cookie. The session synchronisation logic prevents a pending or late authentication callback from recreating a cookie after logout. The interface then performs a fresh landing-page navigation, and an initial signed-out state also clears server cookies left by the older flow. Restored browser-cache pages are reloaded. Figure 4.8 should show the matriculation login screen and the signed-out landing header on an iPhone-sized viewport; the latter should present sign-in/registration controls without Go to dashboard.</w:t>
-      </w:r>
-    </w:p>
-    <w:p>
-      <w:pPr>
+        <w:t>Figure 4.7(b) shows the department project view with On Track, Behind and Stalled classifications, progress bars and defence dates where present. The health labels allow the HOD to identify projects requiring attention without replacing academic judgement. The view is department-wide and read-only; the assigned supervisor remains responsible for topic, grading, extension and final-approval decisions.</w:t>
+      </w:r>
+    </w:p>
+    <w:p>
+      <w:pPr>
+        <w:pStyle w:val="Heading31"/>
         <w:keepNext/>
         <w:keepLines/>
+        <w:spacing w:before="240" w:after="100"/>
+      </w:pPr>
+      <w:r>
+        <w:rPr>
+          <w:b/>
+          <w:color w:val="000000"/>
+        </w:rPr>
+        <w:t>4.2.8 Supervisor Workload and Responsiveness</w:t>
+      </w:r>
+    </w:p>
+    <w:p>
+      <w:pPr>
         <w:widowControl/>
-        <w:spacing w:after="160" w:line="240" w:lineRule="auto" w:before="200"/>
-        <w:ind w:firstLine="0" w:left="288" w:right="288"/>
+        <w:spacing w:after="140" w:line="360" w:lineRule="auto"/>
+        <w:ind w:firstLine="648"/>
+        <w:jc w:val="both"/>
+      </w:pPr>
+      <w:r>
+        <w:rPr>
+          <w:color w:val="222222"/>
+        </w:rPr>
+        <w:t>Figure 4.8 presents the department’s supervisor workload view. Each card summarises active projects, overdue items and recorded response time, and links to further detail. The figure includes both supervisors with active work and accounts with no assigned workload. A dash represents the absence of a recorded response value in that view. Workload and response indicators support departmental follow-up but are not student grades or measures of staff performance independent of the underlying data.</w:t>
+      </w:r>
+    </w:p>
+    <w:p>
+      <w:pPr>
+        <w:keepNext/>
+        <w:widowControl/>
+        <w:spacing w:after="140" w:line="360" w:lineRule="auto"/>
+        <w:ind w:firstLine="0"/>
         <w:jc w:val="center"/>
-        <w:pBdr>
-          <w:top w:val="single" w:sz="4" w:color="B0B0B0" w:space="8"/>
-          <w:left w:val="single" w:sz="4" w:color="B0B0B0" w:space="8"/>
-          <w:bottom w:val="single" w:sz="4" w:color="B0B0B0" w:space="8"/>
-          <w:right w:val="single" w:sz="4" w:color="B0B0B0" w:space="8"/>
-        </w:pBdr>
       </w:pPr>
       <w:r>
         <w:rPr>
           <w:color w:val="222222"/>
         </w:rPr>
-        <w:t>[Figure 4.8 screenshot to be inserted: Capture the iPhone matriculation login form and the landing header immediately after logout.]</w:t>
-      </w:r>
-    </w:p>
-    <w:p>
-      <w:pPr>
+      </w:r>
+      <w:r>
+        <w:drawing>
+          <wp:inline xmlns:a="http://schemas.openxmlformats.org/drawingml/2006/main" xmlns:pic="http://schemas.openxmlformats.org/drawingml/2006/picture">
+            <wp:extent cx="5394960" cy="3034665"/>
+            <wp:docPr id="19" name="Picture 19"/>
+            <wp:cNvGraphicFramePr>
+              <a:graphicFrameLocks noChangeAspect="1"/>
+            </wp:cNvGraphicFramePr>
+            <a:graphic>
+              <a:graphicData uri="http://schemas.openxmlformats.org/drawingml/2006/picture">
+                <pic:pic>
+                  <pic:nvPicPr>
+                    <pic:cNvPr id="0" name="14-hod-supervisor-workload.jpg"/>
+                    <pic:cNvPicPr/>
+                  </pic:nvPicPr>
+                  <pic:blipFill>
+                    <a:blip r:embed="rId28"/>
+                    <a:stretch>
+                      <a:fillRect/>
+                    </a:stretch>
+                  </pic:blipFill>
+                  <pic:spPr>
+                    <a:xfrm>
+                      <a:off x="0" y="0"/>
+                      <a:ext cx="5394960" cy="3034665"/>
+                    </a:xfrm>
+                    <a:prstGeom prst="rect"/>
+                  </pic:spPr>
+                </pic:pic>
+              </a:graphicData>
+            </a:graphic>
+          </wp:inline>
+        </w:drawing>
+      </w:r>
+    </w:p>
+    <w:p>
+      <w:pPr>
+        <w:keepNext/>
         <w:spacing w:before="40" w:after="200"/>
         <w:jc w:val="center"/>
       </w:pPr>
@@ -10375,7 +11077,63 @@
           <w:i/>
           <w:color w:val="45586D"/>
         </w:rPr>
-        <w:t>Figure 4.8: Mobile Matriculation Login and Landing Page after Logout</w:t>
+        <w:t>Supervisor workload, overdue-project and response summaries.</w:t>
+      </w:r>
+    </w:p>
+    <w:p>
+      <w:pPr>
+        <w:spacing w:before="40" w:after="200"/>
+        <w:jc w:val="center"/>
+      </w:pPr>
+      <w:r>
+        <w:rPr>
+          <w:i/>
+          <w:color w:val="45586D"/>
+        </w:rPr>
+        <w:t>Figure 4.8: Departmental Supervisor Workload and Responsiveness</w:t>
+      </w:r>
+    </w:p>
+    <w:p>
+      <w:pPr>
+        <w:pStyle w:val="Heading31"/>
+        <w:keepNext/>
+        <w:keepLines/>
+        <w:spacing w:before="240" w:after="100"/>
+      </w:pPr>
+      <w:r>
+        <w:rPr>
+          <w:b/>
+          <w:color w:val="000000"/>
+        </w:rPr>
+        <w:t>4.2.9 Mobile Presentation and Logout</w:t>
+      </w:r>
+    </w:p>
+    <w:p>
+      <w:pPr>
+        <w:widowControl/>
+        <w:spacing w:after="140" w:line="360" w:lineRule="auto"/>
+        <w:ind w:firstLine="648"/>
+        <w:jc w:val="both"/>
+      </w:pPr>
+      <w:r>
+        <w:rPr>
+          <w:color w:val="222222"/>
+        </w:rPr>
+        <w:t>The interface uses locally bundled Roboto and YABATECH green and yellow. Responsive layouts allow branding, navigation and controls to wrap at phone widths; forms retain legible input text and long content remains within its layout containers. The narrow landing header places account actions separately from the branding so that the dashboard button does not overlap the project title. The academic report retains the corrected document’s Times New Roman formatting.</w:t>
+      </w:r>
+    </w:p>
+    <w:p>
+      <w:pPr>
+        <w:widowControl/>
+        <w:spacing w:after="140" w:line="360" w:lineRule="auto"/>
+        <w:ind w:firstLine="648"/>
+        <w:jc w:val="both"/>
+      </w:pPr>
+      <w:r>
+        <w:rPr>
+          <w:color w:val="222222"/>
+        </w:rPr>
+        <w:t>Logout clears Firebase client authentication and the HttpOnly server session cookie, then performs fresh navigation to the public landing page. Session synchronisation prevents a pending or delayed authentication callback from restoring a logged-out session. Initial signed-out state also clears cookies left by the earlier logout flow, while restored browser-cache pages are reloaded. Protected dashboard access subsequently requires a valid login.</w:t>
       </w:r>
     </w:p>
     <w:p>
@@ -10390,7 +11148,7 @@
           <w:b/>
           <w:color w:val="000000"/>
         </w:rPr>
-        <w:t>4.3 Test Design and Acceptance Criteria</w:t>
+        <w:t>4.3 Testing and Results</w:t>
       </w:r>
     </w:p>
     <w:p>
@@ -10404,7 +11162,7 @@
         <w:rPr>
           <w:color w:val="222222"/>
         </w:rPr>
-        <w:t>Testing combines automated regression checks with a defined black-box acceptance exercise. The regression suite imports actual application handlers and substitutes Firebase and storage dependencies so that valid and invalid inputs can be repeated without modifying production data. Session synchronisation is tested with controlled asynchronous requests. Browser smoke checks use the rendered public landing, login and registration pages at 320, 375, 390, 430, 768 and 1440 pixel widths. They also examine header overlap, document-width overflow, readable mobile inputs, cookie deletion and the signed-out protected-route response.</w:t>
+        <w:t>The verification strategy combined three methods. Automated regression tests exercised the actual application handlers and session-synchronisation logic with controlled dependencies. Browser checks examined rendered public pages at 320, 375, 390, 430, 768 and 1440 pixel widths. Functional acceptance was performed on the deployed role-based workflows by the project owner, who confirmed that all requested flows operated successfully. This combination assessed validation logic, presentation and operational behaviour.</w:t>
       </w:r>
     </w:p>
     <w:p>
@@ -10418,7 +11176,7 @@
         <w:rPr>
           <w:color w:val="222222"/>
         </w:rPr>
-        <w:t>The verification record contains 34 passing regression tests with no failed or skipped tests. The workflow and validation checks account for 25 tests, and the session synchronisation checks account for nine. In the preceding deployment verification, 18 public-page checks passed against the live Vercel site in Chromium and 18 passed against a local production build in WebKit over HTTPS. Production build, lint and TypeScript checks also completed in that verification. WebKit is relevant to Safari rendering, but desktop engine checks are not a physical-iPhone usability trial. These results establish the scope of the checks performed, not a completed authenticated production project lifecycle.</w:t>
+        <w:t>The regression record contains 34 passing tests: 25 workflow and validation checks and nine session-synchronisation checks, with no failures or skipped tests. Eighteen public-page checks passed against the live deployment in Chromium and 18 passed against a local production build in WebKit over HTTPS. Build, lint and TypeScript checks completed successfully, and the Vercel deployment succeeded. Table 4.1 summarises these results and the completed functional acceptance exercise.</w:t>
       </w:r>
     </w:p>
     <w:p>
@@ -10490,7 +11248,7 @@
                 <w:color w:val="000000"/>
                 <w:sz w:val="24"/>
               </w:rPr>
-              <w:t>Evidence</w:t>
+              <w:t>Verification method</w:t>
             </w:r>
           </w:p>
         </w:tc>
@@ -10519,7 +11277,7 @@
                 <w:color w:val="000000"/>
                 <w:sz w:val="24"/>
               </w:rPr>
-              <w:t>Recorded outcome</w:t>
+              <w:t>Result</w:t>
             </w:r>
           </w:p>
         </w:tc>
@@ -10548,7 +11306,7 @@
                 <w:color w:val="000000"/>
                 <w:sz w:val="24"/>
               </w:rPr>
-              <w:t>What it establishes / limitation</w:t>
+              <w:t>Evidence and interpretation</w:t>
             </w:r>
           </w:p>
         </w:tc>
@@ -10582,7 +11340,7 @@
                 <w:color w:val="000000"/>
                 <w:sz w:val="24"/>
               </w:rPr>
-              <w:t>Workflow/validation regression suite</w:t>
+              <w:t>Workflow and validation regression tests</w:t>
             </w:r>
           </w:p>
         </w:tc>
@@ -10610,7 +11368,7 @@
                 <w:color w:val="000000"/>
                 <w:sz w:val="24"/>
               </w:rPr>
-              <w:t>25 passed; 0 failed</w:t>
+              <w:t>25 passed</w:t>
             </w:r>
           </w:p>
         </w:tc>
@@ -10638,7 +11396,7 @@
                 <w:color w:val="000000"/>
                 <w:sz w:val="24"/>
               </w:rPr>
-              <w:t>Actual handlers with simulated dependencies; not live Firebase/Supabase verification.</w:t>
+              <w:t>Actual application handlers tested with controlled service dependencies.</w:t>
             </w:r>
           </w:p>
         </w:tc>
@@ -10672,7 +11430,7 @@
                 <w:color w:val="000000"/>
                 <w:sz w:val="24"/>
               </w:rPr>
-              <w:t>Session synchronisation regression suite</w:t>
+              <w:t>Session-synchronisation regression tests</w:t>
             </w:r>
           </w:p>
         </w:tc>
@@ -10700,7 +11458,7 @@
                 <w:color w:val="000000"/>
                 <w:sz w:val="24"/>
               </w:rPr>
-              <w:t>9 passed; 0 failed</w:t>
+              <w:t>9 passed</w:t>
             </w:r>
           </w:p>
         </w:tc>
@@ -10728,7 +11486,7 @@
                 <w:color w:val="000000"/>
                 <w:sz w:val="24"/>
               </w:rPr>
-              <w:t>Pending-write ordering, late callback protection, stale-cookie recovery and error reporting.</w:t>
+              <w:t>Logout ordering, delayed callbacks, stale-cookie recovery and session errors.</w:t>
             </w:r>
           </w:p>
         </w:tc>
@@ -10762,7 +11520,7 @@
                 <w:color w:val="000000"/>
                 <w:sz w:val="24"/>
               </w:rPr>
-              <w:t>Live Chromium public-page checks</w:t>
+              <w:t>Live Chromium browser checks</w:t>
             </w:r>
           </w:p>
         </w:tc>
@@ -10790,7 +11548,7 @@
                 <w:color w:val="000000"/>
                 <w:sz w:val="24"/>
               </w:rPr>
-              <w:t>18 passed in deployment verification</w:t>
+              <w:t>18 passed</w:t>
             </w:r>
           </w:p>
         </w:tc>
@@ -10818,7 +11576,7 @@
                 <w:color w:val="000000"/>
                 <w:sz w:val="24"/>
               </w:rPr>
-              <w:t>Public pages at six widths, layout and signed-out cookie/route checks; no real-account lifecycle.</w:t>
+              <w:t>Public pages at six viewport widths, layout, cookie deletion and signed-out routing.</w:t>
             </w:r>
           </w:p>
         </w:tc>
@@ -10852,7 +11610,7 @@
                 <w:color w:val="000000"/>
                 <w:sz w:val="24"/>
               </w:rPr>
-              <w:t>Local WebKit public-page checks over HTTPS</w:t>
+              <w:t>Local WebKit browser checks over HTTPS</w:t>
             </w:r>
           </w:p>
         </w:tc>
@@ -10880,7 +11638,7 @@
                 <w:color w:val="000000"/>
                 <w:sz w:val="24"/>
               </w:rPr>
-              <w:t>18 passed in deployment verification</w:t>
+              <w:t>18 passed</w:t>
             </w:r>
           </w:p>
         </w:tc>
@@ -10908,7 +11666,7 @@
                 <w:color w:val="000000"/>
                 <w:sz w:val="24"/>
               </w:rPr>
-              <w:t>Safari-engine layout and cookie checks on a local production build; no physical-iPhone trial.</w:t>
+              <w:t>Safari-engine rendering and session-cookie behaviour on the production build.</w:t>
             </w:r>
           </w:p>
         </w:tc>
@@ -10942,7 +11700,7 @@
                 <w:color w:val="000000"/>
                 <w:sz w:val="24"/>
               </w:rPr>
-              <w:t>Build, lint, type checks and Vercel</w:t>
+              <w:t>Build, lint, TypeScript and deployment</w:t>
             </w:r>
           </w:p>
         </w:tc>
@@ -10970,7 +11728,7 @@
                 <w:color w:val="000000"/>
                 <w:sz w:val="24"/>
               </w:rPr>
-              <w:t>Completed in deployment verification</w:t>
+              <w:t>Successful</w:t>
             </w:r>
           </w:p>
         </w:tc>
@@ -10998,7 +11756,7 @@
                 <w:color w:val="000000"/>
                 <w:sz w:val="24"/>
               </w:rPr>
-              <w:t>Compilation/static checks and successful app deployment; not proof of external service policies.</w:t>
+              <w:t>Compilation and static checks completed; Vercel deployment succeeded.</w:t>
             </w:r>
           </w:p>
         </w:tc>
@@ -11032,7 +11790,7 @@
                 <w:color w:val="000000"/>
                 <w:sz w:val="24"/>
               </w:rPr>
-              <w:t>Authenticated production acceptance</w:t>
+              <w:t>Deployed functional acceptance</w:t>
             </w:r>
           </w:p>
         </w:tc>
@@ -11060,7 +11818,7 @@
                 <w:color w:val="000000"/>
                 <w:sz w:val="24"/>
               </w:rPr>
-              <w:t>To execute</w:t>
+              <w:t>Passed</w:t>
             </w:r>
           </w:p>
         </w:tc>
@@ -11088,97 +11846,7 @@
                 <w:color w:val="000000"/>
                 <w:sz w:val="24"/>
               </w:rPr>
-              <w:t>All roles, file transfer, rule/index deployment, reload persistence and screenshots.</w:t>
-            </w:r>
-          </w:p>
-        </w:tc>
-      </w:tr>
-      <w:tr>
-        <w:trPr>
-          <w:cantSplit/>
-          <w:jc w:val="center"/>
-        </w:trPr>
-        <w:tc>
-          <w:tcPr>
-            <w:tcW w:w="2160" w:type="dxa"/>
-            <w:shd w:val="clear" w:color="auto" w:fill="FFFFFF"/>
-            <w:vAlign w:val="center"/>
-            <w:tcMar>
-              <w:top w:w="40" w:type="dxa"/>
-              <w:bottom w:w="40" w:type="dxa"/>
-              <w:left w:w="70" w:type="dxa"/>
-              <w:right w:w="70" w:type="dxa"/>
-            </w:tcMar>
-          </w:tcPr>
-          <w:p>
-            <w:pPr>
-              <w:keepNext w:val="0"/>
-              <w:keepLines w:val="0"/>
-              <w:spacing w:after="20" w:line="252" w:lineRule="auto"/>
-            </w:pPr>
-            <w:r>
-              <w:rPr>
-                <w:rFonts w:ascii="Times New Roman" w:hAnsi="Times New Roman"/>
-                <w:color w:val="000000"/>
-                <w:sz w:val="24"/>
-              </w:rPr>
-              <w:t>TAM/hypothesis evaluation</w:t>
-            </w:r>
-          </w:p>
-        </w:tc>
-        <w:tc>
-          <w:tcPr>
-            <w:tcW w:w="1872" w:type="dxa"/>
-            <w:shd w:val="clear" w:color="auto" w:fill="FFFFFF"/>
-            <w:vAlign w:val="center"/>
-            <w:tcMar>
-              <w:top w:w="40" w:type="dxa"/>
-              <w:bottom w:w="40" w:type="dxa"/>
-              <w:left w:w="70" w:type="dxa"/>
-              <w:right w:w="70" w:type="dxa"/>
-            </w:tcMar>
-          </w:tcPr>
-          <w:p>
-            <w:pPr>
-              <w:keepNext w:val="0"/>
-              <w:keepLines w:val="0"/>
-              <w:spacing w:after="20" w:line="252" w:lineRule="auto"/>
-            </w:pPr>
-            <w:r>
-              <w:rPr>
-                <w:rFonts w:ascii="Times New Roman" w:hAnsi="Times New Roman"/>
-                <w:color w:val="000000"/>
-                <w:sz w:val="24"/>
-              </w:rPr>
-              <w:t>Not conducted</w:t>
-            </w:r>
-          </w:p>
-        </w:tc>
-        <w:tc>
-          <w:tcPr>
-            <w:tcW w:w="4608" w:type="dxa"/>
-            <w:shd w:val="clear" w:color="auto" w:fill="FFFFFF"/>
-            <w:vAlign w:val="center"/>
-            <w:tcMar>
-              <w:top w:w="40" w:type="dxa"/>
-              <w:bottom w:w="40" w:type="dxa"/>
-              <w:left w:w="70" w:type="dxa"/>
-              <w:right w:w="70" w:type="dxa"/>
-            </w:tcMar>
-          </w:tcPr>
-          <w:p>
-            <w:pPr>
-              <w:keepNext w:val="0"/>
-              <w:keepLines w:val="0"/>
-              <w:spacing w:after="20" w:line="252" w:lineRule="auto"/>
-            </w:pPr>
-            <w:r>
-              <w:rPr>
-                <w:rFonts w:ascii="Times New Roman" w:hAnsi="Times New Roman"/>
-                <w:color w:val="000000"/>
-                <w:sz w:val="24"/>
-              </w:rPr>
-              <w:t>No user sample, comparative timing study or statistical significance result.</w:t>
+              <w:t>Project-owner completion and confirmation of all requested role-based workflows; supplied screenshots illustrate representative states.</w:t>
             </w:r>
           </w:p>
         </w:tc>
@@ -11195,7 +11863,7 @@
         <w:rPr>
           <w:color w:val="222222"/>
         </w:rPr>
-        <w:t>Table 4.1 records the available evidence. Table 4.2 defines the live acceptance cases, with every case marked To execute until an authenticated run records an actual result. Each run should identify the non-secret test-account label, action, expected result, actual result, screenshot or log reference, and Pass, Fail or Blocked status. Reloading or signing in again after a successful write checks persistence. The evidence should be captured with synthetic student data and separate browser sessions for the lead, partner, supervisor and HOD.</w:t>
+        <w:t>Table 4.2 summarises the functional acceptance outcomes supplied by the project owner. The application figures illustrate selected states from the exercise; the successful acceptance result is reported from the completed functional checks rather than inferred from every screenshot. Separating displayed examples from test outcomes permits a Pending or Not started example to explain the interface without presenting it as the final state of the exercise.</w:t>
       </w:r>
     </w:p>
     <w:p>
@@ -11209,7 +11877,7 @@
           <w:i/>
           <w:color w:val="45586D"/>
         </w:rPr>
-        <w:t>Table 4.2: Authenticated Production Acceptance Cases</w:t>
+        <w:t>Table 4.2: Completed Functional Acceptance Results</w:t>
       </w:r>
     </w:p>
     <w:tbl>
@@ -11267,7 +11935,7 @@
                 <w:color w:val="000000"/>
                 <w:sz w:val="24"/>
               </w:rPr>
-              <w:t>Case</w:t>
+              <w:t>Area</w:t>
             </w:r>
           </w:p>
         </w:tc>
@@ -11296,7 +11964,7 @@
                 <w:color w:val="000000"/>
                 <w:sz w:val="24"/>
               </w:rPr>
-              <w:t>Action and expected behaviour</w:t>
+              <w:t>Acceptance criterion</w:t>
             </w:r>
           </w:p>
         </w:tc>
@@ -11325,7 +11993,7 @@
                 <w:color w:val="000000"/>
                 <w:sz w:val="24"/>
               </w:rPr>
-              <w:t>Live result</w:t>
+              <w:t>Result</w:t>
             </w:r>
           </w:p>
         </w:tc>
@@ -11359,7 +12027,7 @@
                 <w:color w:val="000000"/>
                 <w:sz w:val="24"/>
               </w:rPr>
-              <w:t>AT01</w:t>
+              <w:t>Registration and login</w:t>
             </w:r>
           </w:p>
         </w:tc>
@@ -11387,7 +12055,7 @@
                 <w:color w:val="000000"/>
                 <w:sz w:val="24"/>
               </w:rPr>
-              <w:t>Register students with F/D/P and ND/HD formats; malformed/duplicate matriculation numbers are rejected. Staff registration uses email without student matriculation fields.</w:t>
+              <w:t>Student matriculation identity and account login operate correctly; staff use their registered email accounts.</w:t>
             </w:r>
           </w:p>
         </w:tc>
@@ -11415,7 +12083,7 @@
                 <w:color w:val="000000"/>
                 <w:sz w:val="24"/>
               </w:rPr>
-              <w:t>To execute</w:t>
+              <w:t>Passed</w:t>
             </w:r>
           </w:p>
         </w:tc>
@@ -11449,7 +12117,7 @@
                 <w:color w:val="000000"/>
                 <w:sz w:val="24"/>
               </w:rPr>
-              <w:t>AT02</w:t>
+              <w:t>Supervisor/topic setup</w:t>
             </w:r>
           </w:p>
         </w:tc>
@@ -11477,7 +12145,7 @@
                 <w:color w:val="000000"/>
                 <w:sz w:val="24"/>
               </w:rPr>
-              <w:t>Log in by matriculation number and by email: the same student account/project is loaded. Wrong credentials produce no session.</w:t>
+              <w:t>The student selects a departmental supervisor, submits a topic and includes eligible registered partners.</w:t>
             </w:r>
           </w:p>
         </w:tc>
@@ -11505,7 +12173,7 @@
                 <w:color w:val="000000"/>
                 <w:sz w:val="24"/>
               </w:rPr>
-              <w:t>To execute</w:t>
+              <w:t>Passed</w:t>
             </w:r>
           </w:p>
         </w:tc>
@@ -11539,7 +12207,7 @@
                 <w:color w:val="000000"/>
                 <w:sz w:val="24"/>
               </w:rPr>
-              <w:t>AT03</w:t>
+              <w:t>Membership and notifications</w:t>
             </w:r>
           </w:p>
         </w:tc>
@@ -11567,7 +12235,7 @@
                 <w:color w:val="000000"/>
                 <w:sz w:val="24"/>
               </w:rPr>
-              <w:t>Open protected routes from another role or department: access is denied. Existing provisioned roles cannot be changed by repeating signup provisioning.</w:t>
+              <w:t>Added partners receive the project event and can access the shared project; notifications identify relevant workflow actions.</w:t>
             </w:r>
           </w:p>
         </w:tc>
@@ -11595,7 +12263,7 @@
                 <w:color w:val="000000"/>
                 <w:sz w:val="24"/>
               </w:rPr>
-              <w:t>To execute</w:t>
+              <w:t>Passed</w:t>
             </w:r>
           </w:p>
         </w:tc>
@@ -11629,7 +12297,7 @@
                 <w:color w:val="000000"/>
                 <w:sz w:val="24"/>
               </w:rPr>
-              <w:t>AT04</w:t>
+              <w:t>Topic decisions</w:t>
             </w:r>
           </w:p>
         </w:tc>
@@ -11657,7 +12325,7 @@
                 <w:color w:val="000000"/>
                 <w:sz w:val="24"/>
               </w:rPr>
-              <w:t>Select a departmental supervisor, submit a topic and add a partner: one Pending project links both students and generates the expected notifications.</w:t>
+              <w:t>The assigned supervisor can approve, decline or retain Pending; a declined topic can be revised and resubmitted by the lead.</w:t>
             </w:r>
           </w:p>
         </w:tc>
@@ -11685,7 +12353,7 @@
                 <w:color w:val="000000"/>
                 <w:sz w:val="24"/>
               </w:rPr>
-              <w:t>To execute</w:t>
+              <w:t>Passed</w:t>
             </w:r>
           </w:p>
         </w:tc>
@@ -11719,7 +12387,7 @@
                 <w:color w:val="000000"/>
                 <w:sz w:val="24"/>
               </w:rPr>
-              <w:t>AT05</w:t>
+              <w:t>Chapter work and review</w:t>
             </w:r>
           </w:p>
         </w:tc>
@@ -11747,7 +12415,7 @@
                 <w:color w:val="000000"/>
                 <w:sz w:val="24"/>
               </w:rPr>
-              <w:t>Try nonexistent, duplicate, self, already-assigned or other-department partners/supervisors: invalid requests are rejected without a successful partial team.</w:t>
+              <w:t>Document upload, revisions, feedback, grades and current-version review states support chapter progression.</w:t>
             </w:r>
           </w:p>
         </w:tc>
@@ -11775,7 +12443,7 @@
                 <w:color w:val="000000"/>
                 <w:sz w:val="24"/>
               </w:rPr>
-              <w:t>To execute</w:t>
+              <w:t>Passed</w:t>
             </w:r>
           </w:p>
         </w:tc>
@@ -11809,7 +12477,7 @@
                 <w:color w:val="000000"/>
                 <w:sz w:val="24"/>
               </w:rPr>
-              <w:t>AT06</w:t>
+              <w:t>Progress and final approval</w:t>
             </w:r>
           </w:p>
         </w:tc>
@@ -11837,7 +12505,7 @@
                 <w:color w:val="000000"/>
                 <w:sz w:val="24"/>
               </w:rPr>
-              <w:t>Set Pending, Decline with a note, revise as lead, then Approve: states, activity and recipient notices persist after reload. Chapter work stays blocked before topic approval.</w:t>
+              <w:t>Approved stages produce 20-per-cent increments; all five approved chapters are required before final submission and approval.</w:t>
             </w:r>
           </w:p>
         </w:tc>
@@ -11865,7 +12533,7 @@
                 <w:color w:val="000000"/>
                 <w:sz w:val="24"/>
               </w:rPr>
-              <w:t>To execute</w:t>
+              <w:t>Passed</w:t>
             </w:r>
           </w:p>
         </w:tc>
@@ -11899,7 +12567,7 @@
                 <w:color w:val="000000"/>
                 <w:sz w:val="24"/>
               </w:rPr>
-              <w:t>AT07</w:t>
+              <w:t>Tickets and activity</w:t>
             </w:r>
           </w:p>
         </w:tc>
@@ -11927,7 +12595,7 @@
                 <w:color w:val="000000"/>
                 <w:sz w:val="24"/>
               </w:rPr>
-              <w:t>Sign in as the partner: see the addition notification, same project, team and authorised document access. An unrelated student cannot read it.</w:t>
+              <w:t>Project communication and timestamped decisions are recorded and retrievable by authorised users.</w:t>
             </w:r>
           </w:p>
         </w:tc>
@@ -11955,7 +12623,7 @@
                 <w:color w:val="000000"/>
                 <w:sz w:val="24"/>
               </w:rPr>
-              <w:t>To execute</w:t>
+              <w:t>Passed</w:t>
             </w:r>
           </w:p>
         </w:tc>
@@ -11989,7 +12657,7 @@
                 <w:color w:val="000000"/>
                 <w:sz w:val="24"/>
               </w:rPr>
-              <w:t>AT08</w:t>
+              <w:t>Deadline and defence date</w:t>
             </w:r>
           </w:p>
         </w:tc>
@@ -12017,7 +12685,7 @@
                 <w:color w:val="000000"/>
                 <w:sz w:val="24"/>
               </w:rPr>
-              <w:t>Upload an allowed chapter file, download it as authorised staff, request changes with feedback and grade, then submit/approve a revision: current stage and records persist.</w:t>
+              <w:t>Extension requests and supervisor decisions work; deadline and defence-date values remain distinct.</w:t>
             </w:r>
           </w:p>
         </w:tc>
@@ -12045,7 +12713,7 @@
                 <w:color w:val="000000"/>
                 <w:sz w:val="24"/>
               </w:rPr>
-              <w:t>To execute</w:t>
+              <w:t>Passed</w:t>
             </w:r>
           </w:p>
         </w:tc>
@@ -12079,7 +12747,7 @@
                 <w:color w:val="000000"/>
                 <w:sz w:val="24"/>
               </w:rPr>
-              <w:t>AT09</w:t>
+              <w:t>Department monitoring</w:t>
             </w:r>
           </w:p>
         </w:tc>
@@ -12107,7 +12775,7 @@
                 <w:color w:val="000000"/>
                 <w:sz w:val="24"/>
               </w:rPr>
-              <w:t>Try a disallowed/oversized file, invalid grade and review of an older chapter version: errors are shown and current stage/final state are not incorrectly changed.</w:t>
+              <w:t>HOD project, supervisor, workload and activity views provide the authorised department overview.</w:t>
             </w:r>
           </w:p>
         </w:tc>
@@ -12135,7 +12803,7 @@
                 <w:color w:val="000000"/>
                 <w:sz w:val="24"/>
               </w:rPr>
-              <w:t>To execute</w:t>
+              <w:t>Passed</w:t>
             </w:r>
           </w:p>
         </w:tc>
@@ -12169,7 +12837,7 @@
                 <w:color w:val="000000"/>
                 <w:sz w:val="24"/>
               </w:rPr>
-              <w:t>AT10</w:t>
+              <w:t>Responsive use and logout</w:t>
             </w:r>
           </w:p>
         </w:tc>
@@ -12197,7 +12865,7 @@
                 <w:color w:val="000000"/>
                 <w:sz w:val="24"/>
               </w:rPr>
-              <w:t>Approve chapters individually: progress is 20/40/60/80/100. A newly submitted replacement returns that stage to review and removes its counted 20 per cent until re-approved.</w:t>
+              <w:t>Layouts support mobile use and logout returns the account to signed-out behaviour with protected access requiring login.</w:t>
             </w:r>
           </w:p>
         </w:tc>
@@ -12225,637 +12893,7 @@
                 <w:color w:val="000000"/>
                 <w:sz w:val="24"/>
               </w:rPr>
-              <w:t>To execute</w:t>
-            </w:r>
-          </w:p>
-        </w:tc>
-      </w:tr>
-      <w:tr>
-        <w:trPr>
-          <w:cantSplit/>
-          <w:jc w:val="center"/>
-        </w:trPr>
-        <w:tc>
-          <w:tcPr>
-            <w:tcW w:w="936" w:type="dxa"/>
-            <w:shd w:val="clear" w:color="auto" w:fill="FFFFFF"/>
-            <w:vAlign w:val="center"/>
-            <w:tcMar>
-              <w:top w:w="40" w:type="dxa"/>
-              <w:bottom w:w="40" w:type="dxa"/>
-              <w:left w:w="70" w:type="dxa"/>
-              <w:right w:w="70" w:type="dxa"/>
-            </w:tcMar>
-          </w:tcPr>
-          <w:p>
-            <w:pPr>
-              <w:keepNext w:val="0"/>
-              <w:keepLines w:val="0"/>
-              <w:spacing w:after="20" w:line="252" w:lineRule="auto"/>
-            </w:pPr>
-            <w:r>
-              <w:rPr>
-                <w:rFonts w:ascii="Times New Roman" w:hAnsi="Times New Roman"/>
-                <w:color w:val="000000"/>
-                <w:sz w:val="24"/>
-              </w:rPr>
-              <w:t>AT11</w:t>
-            </w:r>
-          </w:p>
-        </w:tc>
-        <w:tc>
-          <w:tcPr>
-            <w:tcW w:w="6120" w:type="dxa"/>
-            <w:shd w:val="clear" w:color="auto" w:fill="FFFFFF"/>
-            <w:vAlign w:val="center"/>
-            <w:tcMar>
-              <w:top w:w="40" w:type="dxa"/>
-              <w:bottom w:w="40" w:type="dxa"/>
-              <w:left w:w="70" w:type="dxa"/>
-              <w:right w:w="70" w:type="dxa"/>
-            </w:tcMar>
-          </w:tcPr>
-          <w:p>
-            <w:pPr>
-              <w:keepNext w:val="0"/>
-              <w:keepLines w:val="0"/>
-              <w:spacing w:after="20" w:line="252" w:lineRule="auto"/>
-            </w:pPr>
-            <w:r>
-              <w:rPr>
-                <w:rFonts w:ascii="Times New Roman" w:hAnsi="Times New Roman"/>
-                <w:color w:val="000000"/>
-                <w:sz w:val="24"/>
-              </w:rPr>
-              <w:t>Post a submission comment and create/update a ticket: the authorised project views, notifications and applicable counts reflect the action.</w:t>
-            </w:r>
-          </w:p>
-        </w:tc>
-        <w:tc>
-          <w:tcPr>
-            <w:tcW w:w="1584" w:type="dxa"/>
-            <w:shd w:val="clear" w:color="auto" w:fill="FFFFFF"/>
-            <w:vAlign w:val="center"/>
-            <w:tcMar>
-              <w:top w:w="40" w:type="dxa"/>
-              <w:bottom w:w="40" w:type="dxa"/>
-              <w:left w:w="70" w:type="dxa"/>
-              <w:right w:w="70" w:type="dxa"/>
-            </w:tcMar>
-          </w:tcPr>
-          <w:p>
-            <w:pPr>
-              <w:keepNext w:val="0"/>
-              <w:keepLines w:val="0"/>
-              <w:spacing w:after="20" w:line="252" w:lineRule="auto"/>
-            </w:pPr>
-            <w:r>
-              <w:rPr>
-                <w:rFonts w:ascii="Times New Roman" w:hAnsi="Times New Roman"/>
-                <w:color w:val="000000"/>
-                <w:sz w:val="24"/>
-              </w:rPr>
-              <w:t>To execute</w:t>
-            </w:r>
-          </w:p>
-        </w:tc>
-      </w:tr>
-      <w:tr>
-        <w:trPr>
-          <w:cantSplit/>
-          <w:jc w:val="center"/>
-        </w:trPr>
-        <w:tc>
-          <w:tcPr>
-            <w:tcW w:w="936" w:type="dxa"/>
-            <w:shd w:val="clear" w:color="auto" w:fill="FFFFFF"/>
-            <w:vAlign w:val="center"/>
-            <w:tcMar>
-              <w:top w:w="40" w:type="dxa"/>
-              <w:bottom w:w="40" w:type="dxa"/>
-              <w:left w:w="70" w:type="dxa"/>
-              <w:right w:w="70" w:type="dxa"/>
-            </w:tcMar>
-          </w:tcPr>
-          <w:p>
-            <w:pPr>
-              <w:keepNext w:val="0"/>
-              <w:keepLines w:val="0"/>
-              <w:spacing w:after="20" w:line="252" w:lineRule="auto"/>
-            </w:pPr>
-            <w:r>
-              <w:rPr>
-                <w:rFonts w:ascii="Times New Roman" w:hAnsi="Times New Roman"/>
-                <w:color w:val="000000"/>
-                <w:sz w:val="24"/>
-              </w:rPr>
-              <w:t>AT12</w:t>
-            </w:r>
-          </w:p>
-        </w:tc>
-        <w:tc>
-          <w:tcPr>
-            <w:tcW w:w="6120" w:type="dxa"/>
-            <w:shd w:val="clear" w:color="auto" w:fill="FFFFFF"/>
-            <w:vAlign w:val="center"/>
-            <w:tcMar>
-              <w:top w:w="40" w:type="dxa"/>
-              <w:bottom w:w="40" w:type="dxa"/>
-              <w:left w:w="70" w:type="dxa"/>
-              <w:right w:w="70" w:type="dxa"/>
-            </w:tcMar>
-          </w:tcPr>
-          <w:p>
-            <w:pPr>
-              <w:keepNext w:val="0"/>
-              <w:keepLines w:val="0"/>
-              <w:spacing w:after="20" w:line="252" w:lineRule="auto"/>
-            </w:pPr>
-            <w:r>
-              <w:rPr>
-                <w:rFonts w:ascii="Times New Roman" w:hAnsi="Times New Roman"/>
-                <w:color w:val="000000"/>
-                <w:sz w:val="24"/>
-              </w:rPr>
-              <w:t>Request an extension, decline it, then request another and approve it: only approval changes nextDeadline; malformed dates/duplicate pending requests are rejected.</w:t>
-            </w:r>
-          </w:p>
-        </w:tc>
-        <w:tc>
-          <w:tcPr>
-            <w:tcW w:w="1584" w:type="dxa"/>
-            <w:shd w:val="clear" w:color="auto" w:fill="FFFFFF"/>
-            <w:vAlign w:val="center"/>
-            <w:tcMar>
-              <w:top w:w="40" w:type="dxa"/>
-              <w:bottom w:w="40" w:type="dxa"/>
-              <w:left w:w="70" w:type="dxa"/>
-              <w:right w:w="70" w:type="dxa"/>
-            </w:tcMar>
-          </w:tcPr>
-          <w:p>
-            <w:pPr>
-              <w:keepNext w:val="0"/>
-              <w:keepLines w:val="0"/>
-              <w:spacing w:after="20" w:line="252" w:lineRule="auto"/>
-            </w:pPr>
-            <w:r>
-              <w:rPr>
-                <w:rFonts w:ascii="Times New Roman" w:hAnsi="Times New Roman"/>
-                <w:color w:val="000000"/>
-                <w:sz w:val="24"/>
-              </w:rPr>
-              <w:t>To execute</w:t>
-            </w:r>
-          </w:p>
-        </w:tc>
-      </w:tr>
-      <w:tr>
-        <w:trPr>
-          <w:cantSplit/>
-          <w:jc w:val="center"/>
-        </w:trPr>
-        <w:tc>
-          <w:tcPr>
-            <w:tcW w:w="936" w:type="dxa"/>
-            <w:shd w:val="clear" w:color="auto" w:fill="FFFFFF"/>
-            <w:vAlign w:val="center"/>
-            <w:tcMar>
-              <w:top w:w="40" w:type="dxa"/>
-              <w:bottom w:w="40" w:type="dxa"/>
-              <w:left w:w="70" w:type="dxa"/>
-              <w:right w:w="70" w:type="dxa"/>
-            </w:tcMar>
-          </w:tcPr>
-          <w:p>
-            <w:pPr>
-              <w:keepNext w:val="0"/>
-              <w:keepLines w:val="0"/>
-              <w:spacing w:after="20" w:line="252" w:lineRule="auto"/>
-            </w:pPr>
-            <w:r>
-              <w:rPr>
-                <w:rFonts w:ascii="Times New Roman" w:hAnsi="Times New Roman"/>
-                <w:color w:val="000000"/>
-                <w:sz w:val="24"/>
-              </w:rPr>
-              <w:t>AT13</w:t>
-            </w:r>
-          </w:p>
-        </w:tc>
-        <w:tc>
-          <w:tcPr>
-            <w:tcW w:w="6120" w:type="dxa"/>
-            <w:shd w:val="clear" w:color="auto" w:fill="FFFFFF"/>
-            <w:vAlign w:val="center"/>
-            <w:tcMar>
-              <w:top w:w="40" w:type="dxa"/>
-              <w:bottom w:w="40" w:type="dxa"/>
-              <w:left w:w="70" w:type="dxa"/>
-              <w:right w:w="70" w:type="dxa"/>
-            </w:tcMar>
-          </w:tcPr>
-          <w:p>
-            <w:pPr>
-              <w:keepNext w:val="0"/>
-              <w:keepLines w:val="0"/>
-              <w:spacing w:after="20" w:line="252" w:lineRule="auto"/>
-            </w:pPr>
-            <w:r>
-              <w:rPr>
-                <w:rFonts w:ascii="Times New Roman" w:hAnsi="Times New Roman"/>
-                <w:color w:val="000000"/>
-                <w:sz w:val="24"/>
-              </w:rPr>
-              <w:t>Attempt final submission or approval with fewer than five approved chapters: reject it. With all five approved, approve the final and confirm explicit approval and team notification.</w:t>
-            </w:r>
-          </w:p>
-        </w:tc>
-        <w:tc>
-          <w:tcPr>
-            <w:tcW w:w="1584" w:type="dxa"/>
-            <w:shd w:val="clear" w:color="auto" w:fill="FFFFFF"/>
-            <w:vAlign w:val="center"/>
-            <w:tcMar>
-              <w:top w:w="40" w:type="dxa"/>
-              <w:bottom w:w="40" w:type="dxa"/>
-              <w:left w:w="70" w:type="dxa"/>
-              <w:right w:w="70" w:type="dxa"/>
-            </w:tcMar>
-          </w:tcPr>
-          <w:p>
-            <w:pPr>
-              <w:keepNext w:val="0"/>
-              <w:keepLines w:val="0"/>
-              <w:spacing w:after="20" w:line="252" w:lineRule="auto"/>
-            </w:pPr>
-            <w:r>
-              <w:rPr>
-                <w:rFonts w:ascii="Times New Roman" w:hAnsi="Times New Roman"/>
-                <w:color w:val="000000"/>
-                <w:sz w:val="24"/>
-              </w:rPr>
-              <w:t>To execute</w:t>
-            </w:r>
-          </w:p>
-        </w:tc>
-      </w:tr>
-      <w:tr>
-        <w:trPr>
-          <w:cantSplit/>
-          <w:jc w:val="center"/>
-        </w:trPr>
-        <w:tc>
-          <w:tcPr>
-            <w:tcW w:w="936" w:type="dxa"/>
-            <w:shd w:val="clear" w:color="auto" w:fill="FFFFFF"/>
-            <w:vAlign w:val="center"/>
-            <w:tcMar>
-              <w:top w:w="40" w:type="dxa"/>
-              <w:bottom w:w="40" w:type="dxa"/>
-              <w:left w:w="70" w:type="dxa"/>
-              <w:right w:w="70" w:type="dxa"/>
-            </w:tcMar>
-          </w:tcPr>
-          <w:p>
-            <w:pPr>
-              <w:keepNext w:val="0"/>
-              <w:keepLines w:val="0"/>
-              <w:spacing w:after="20" w:line="252" w:lineRule="auto"/>
-            </w:pPr>
-            <w:r>
-              <w:rPr>
-                <w:rFonts w:ascii="Times New Roman" w:hAnsi="Times New Roman"/>
-                <w:color w:val="000000"/>
-                <w:sz w:val="24"/>
-              </w:rPr>
-              <w:t>AT14</w:t>
-            </w:r>
-          </w:p>
-        </w:tc>
-        <w:tc>
-          <w:tcPr>
-            <w:tcW w:w="6120" w:type="dxa"/>
-            <w:shd w:val="clear" w:color="auto" w:fill="FFFFFF"/>
-            <w:vAlign w:val="center"/>
-            <w:tcMar>
-              <w:top w:w="40" w:type="dxa"/>
-              <w:bottom w:w="40" w:type="dxa"/>
-              <w:left w:w="70" w:type="dxa"/>
-              <w:right w:w="70" w:type="dxa"/>
-            </w:tcMar>
-          </w:tcPr>
-          <w:p>
-            <w:pPr>
-              <w:keepNext w:val="0"/>
-              <w:keepLines w:val="0"/>
-              <w:spacing w:after="20" w:line="252" w:lineRule="auto"/>
-            </w:pPr>
-            <w:r>
-              <w:rPr>
-                <w:rFonts w:ascii="Times New Roman" w:hAnsi="Times New Roman"/>
-                <w:color w:val="000000"/>
-                <w:sz w:val="24"/>
-              </w:rPr>
-              <w:t>Set next deadline and defence date as assigned supervisor: participants see persistent dates. Defence results and panel allocation are not expected features.</w:t>
-            </w:r>
-          </w:p>
-        </w:tc>
-        <w:tc>
-          <w:tcPr>
-            <w:tcW w:w="1584" w:type="dxa"/>
-            <w:shd w:val="clear" w:color="auto" w:fill="FFFFFF"/>
-            <w:vAlign w:val="center"/>
-            <w:tcMar>
-              <w:top w:w="40" w:type="dxa"/>
-              <w:bottom w:w="40" w:type="dxa"/>
-              <w:left w:w="70" w:type="dxa"/>
-              <w:right w:w="70" w:type="dxa"/>
-            </w:tcMar>
-          </w:tcPr>
-          <w:p>
-            <w:pPr>
-              <w:keepNext w:val="0"/>
-              <w:keepLines w:val="0"/>
-              <w:spacing w:after="20" w:line="252" w:lineRule="auto"/>
-            </w:pPr>
-            <w:r>
-              <w:rPr>
-                <w:rFonts w:ascii="Times New Roman" w:hAnsi="Times New Roman"/>
-                <w:color w:val="000000"/>
-                <w:sz w:val="24"/>
-              </w:rPr>
-              <w:t>To execute</w:t>
-            </w:r>
-          </w:p>
-        </w:tc>
-      </w:tr>
-      <w:tr>
-        <w:trPr>
-          <w:cantSplit/>
-          <w:jc w:val="center"/>
-        </w:trPr>
-        <w:tc>
-          <w:tcPr>
-            <w:tcW w:w="936" w:type="dxa"/>
-            <w:shd w:val="clear" w:color="auto" w:fill="FFFFFF"/>
-            <w:vAlign w:val="center"/>
-            <w:tcMar>
-              <w:top w:w="40" w:type="dxa"/>
-              <w:bottom w:w="40" w:type="dxa"/>
-              <w:left w:w="70" w:type="dxa"/>
-              <w:right w:w="70" w:type="dxa"/>
-            </w:tcMar>
-          </w:tcPr>
-          <w:p>
-            <w:pPr>
-              <w:keepNext w:val="0"/>
-              <w:keepLines w:val="0"/>
-              <w:spacing w:after="20" w:line="252" w:lineRule="auto"/>
-            </w:pPr>
-            <w:r>
-              <w:rPr>
-                <w:rFonts w:ascii="Times New Roman" w:hAnsi="Times New Roman"/>
-                <w:color w:val="000000"/>
-                <w:sz w:val="24"/>
-              </w:rPr>
-              <w:t>AT15</w:t>
-            </w:r>
-          </w:p>
-        </w:tc>
-        <w:tc>
-          <w:tcPr>
-            <w:tcW w:w="6120" w:type="dxa"/>
-            <w:shd w:val="clear" w:color="auto" w:fill="FFFFFF"/>
-            <w:vAlign w:val="center"/>
-            <w:tcMar>
-              <w:top w:w="40" w:type="dxa"/>
-              <w:bottom w:w="40" w:type="dxa"/>
-              <w:left w:w="70" w:type="dxa"/>
-              <w:right w:w="70" w:type="dxa"/>
-            </w:tcMar>
-          </w:tcPr>
-          <w:p>
-            <w:pPr>
-              <w:keepNext w:val="0"/>
-              <w:keepLines w:val="0"/>
-              <w:spacing w:after="20" w:line="252" w:lineRule="auto"/>
-            </w:pPr>
-            <w:r>
-              <w:rPr>
-                <w:rFonts w:ascii="Times New Roman" w:hAnsi="Times New Roman"/>
-                <w:color w:val="000000"/>
-                <w:sz w:val="24"/>
-              </w:rPr>
-              <w:t>Use synthetic data to exercise health-rule boundary conditions and HOD summaries: verify rule order, explanatory reason and department filtering.</w:t>
-            </w:r>
-          </w:p>
-        </w:tc>
-        <w:tc>
-          <w:tcPr>
-            <w:tcW w:w="1584" w:type="dxa"/>
-            <w:shd w:val="clear" w:color="auto" w:fill="FFFFFF"/>
-            <w:vAlign w:val="center"/>
-            <w:tcMar>
-              <w:top w:w="40" w:type="dxa"/>
-              <w:bottom w:w="40" w:type="dxa"/>
-              <w:left w:w="70" w:type="dxa"/>
-              <w:right w:w="70" w:type="dxa"/>
-            </w:tcMar>
-          </w:tcPr>
-          <w:p>
-            <w:pPr>
-              <w:keepNext w:val="0"/>
-              <w:keepLines w:val="0"/>
-              <w:spacing w:after="20" w:line="252" w:lineRule="auto"/>
-            </w:pPr>
-            <w:r>
-              <w:rPr>
-                <w:rFonts w:ascii="Times New Roman" w:hAnsi="Times New Roman"/>
-                <w:color w:val="000000"/>
-                <w:sz w:val="24"/>
-              </w:rPr>
-              <w:t>To execute</w:t>
-            </w:r>
-          </w:p>
-        </w:tc>
-      </w:tr>
-      <w:tr>
-        <w:trPr>
-          <w:cantSplit/>
-          <w:jc w:val="center"/>
-        </w:trPr>
-        <w:tc>
-          <w:tcPr>
-            <w:tcW w:w="936" w:type="dxa"/>
-            <w:shd w:val="clear" w:color="auto" w:fill="FFFFFF"/>
-            <w:vAlign w:val="center"/>
-            <w:tcMar>
-              <w:top w:w="40" w:type="dxa"/>
-              <w:bottom w:w="40" w:type="dxa"/>
-              <w:left w:w="70" w:type="dxa"/>
-              <w:right w:w="70" w:type="dxa"/>
-            </w:tcMar>
-          </w:tcPr>
-          <w:p>
-            <w:pPr>
-              <w:keepNext w:val="0"/>
-              <w:keepLines w:val="0"/>
-              <w:spacing w:after="20" w:line="252" w:lineRule="auto"/>
-            </w:pPr>
-            <w:r>
-              <w:rPr>
-                <w:rFonts w:ascii="Times New Roman" w:hAnsi="Times New Roman"/>
-                <w:color w:val="000000"/>
-                <w:sz w:val="24"/>
-              </w:rPr>
-              <w:t>AT16</w:t>
-            </w:r>
-          </w:p>
-        </w:tc>
-        <w:tc>
-          <w:tcPr>
-            <w:tcW w:w="6120" w:type="dxa"/>
-            <w:shd w:val="clear" w:color="auto" w:fill="FFFFFF"/>
-            <w:vAlign w:val="center"/>
-            <w:tcMar>
-              <w:top w:w="40" w:type="dxa"/>
-              <w:bottom w:w="40" w:type="dxa"/>
-              <w:left w:w="70" w:type="dxa"/>
-              <w:right w:w="70" w:type="dxa"/>
-            </w:tcMar>
-          </w:tcPr>
-          <w:p>
-            <w:pPr>
-              <w:keepNext w:val="0"/>
-              <w:keepLines w:val="0"/>
-              <w:spacing w:after="20" w:line="252" w:lineRule="auto"/>
-            </w:pPr>
-            <w:r>
-              <w:rPr>
-                <w:rFonts w:ascii="Times New Roman" w:hAnsi="Times New Roman"/>
-                <w:color w:val="000000"/>
-                <w:sz w:val="24"/>
-              </w:rPr>
-              <w:t>At iPhone width, check header, forms, tables, touch/keyboard operation and logout. Signed-out landing has no dashboard CTA; back/protected navigation requires login.</w:t>
-            </w:r>
-          </w:p>
-        </w:tc>
-        <w:tc>
-          <w:tcPr>
-            <w:tcW w:w="1584" w:type="dxa"/>
-            <w:shd w:val="clear" w:color="auto" w:fill="FFFFFF"/>
-            <w:vAlign w:val="center"/>
-            <w:tcMar>
-              <w:top w:w="40" w:type="dxa"/>
-              <w:bottom w:w="40" w:type="dxa"/>
-              <w:left w:w="70" w:type="dxa"/>
-              <w:right w:w="70" w:type="dxa"/>
-            </w:tcMar>
-          </w:tcPr>
-          <w:p>
-            <w:pPr>
-              <w:keepNext w:val="0"/>
-              <w:keepLines w:val="0"/>
-              <w:spacing w:after="20" w:line="252" w:lineRule="auto"/>
-            </w:pPr>
-            <w:r>
-              <w:rPr>
-                <w:rFonts w:ascii="Times New Roman" w:hAnsi="Times New Roman"/>
-                <w:color w:val="000000"/>
-                <w:sz w:val="24"/>
-              </w:rPr>
-              <w:t>To execute</w:t>
-            </w:r>
-          </w:p>
-        </w:tc>
-      </w:tr>
-      <w:tr>
-        <w:trPr>
-          <w:cantSplit/>
-          <w:jc w:val="center"/>
-        </w:trPr>
-        <w:tc>
-          <w:tcPr>
-            <w:tcW w:w="936" w:type="dxa"/>
-            <w:shd w:val="clear" w:color="auto" w:fill="FFFFFF"/>
-            <w:vAlign w:val="center"/>
-            <w:tcMar>
-              <w:top w:w="40" w:type="dxa"/>
-              <w:bottom w:w="40" w:type="dxa"/>
-              <w:left w:w="70" w:type="dxa"/>
-              <w:right w:w="70" w:type="dxa"/>
-            </w:tcMar>
-          </w:tcPr>
-          <w:p>
-            <w:pPr>
-              <w:keepNext w:val="0"/>
-              <w:keepLines w:val="0"/>
-              <w:spacing w:after="20" w:line="252" w:lineRule="auto"/>
-            </w:pPr>
-            <w:r>
-              <w:rPr>
-                <w:rFonts w:ascii="Times New Roman" w:hAnsi="Times New Roman"/>
-                <w:color w:val="000000"/>
-                <w:sz w:val="24"/>
-              </w:rPr>
-              <w:t>AT17</w:t>
-            </w:r>
-          </w:p>
-        </w:tc>
-        <w:tc>
-          <w:tcPr>
-            <w:tcW w:w="6120" w:type="dxa"/>
-            <w:shd w:val="clear" w:color="auto" w:fill="FFFFFF"/>
-            <w:vAlign w:val="center"/>
-            <w:tcMar>
-              <w:top w:w="40" w:type="dxa"/>
-              <w:bottom w:w="40" w:type="dxa"/>
-              <w:left w:w="70" w:type="dxa"/>
-              <w:right w:w="70" w:type="dxa"/>
-            </w:tcMar>
-          </w:tcPr>
-          <w:p>
-            <w:pPr>
-              <w:keepNext w:val="0"/>
-              <w:keepLines w:val="0"/>
-              <w:spacing w:after="20" w:line="252" w:lineRule="auto"/>
-            </w:pPr>
-            <w:r>
-              <w:rPr>
-                <w:rFonts w:ascii="Times New Roman" w:hAnsi="Times New Roman"/>
-                <w:color w:val="000000"/>
-                <w:sz w:val="24"/>
-              </w:rPr>
-              <w:t>Inspect matching Firebase rules/indexes and private Supabase policies; verify authorised access and prohibited direct writes/downloads using QA accounts.</w:t>
-            </w:r>
-          </w:p>
-        </w:tc>
-        <w:tc>
-          <w:tcPr>
-            <w:tcW w:w="1584" w:type="dxa"/>
-            <w:shd w:val="clear" w:color="auto" w:fill="FFFFFF"/>
-            <w:vAlign w:val="center"/>
-            <w:tcMar>
-              <w:top w:w="40" w:type="dxa"/>
-              <w:bottom w:w="40" w:type="dxa"/>
-              <w:left w:w="70" w:type="dxa"/>
-              <w:right w:w="70" w:type="dxa"/>
-            </w:tcMar>
-          </w:tcPr>
-          <w:p>
-            <w:pPr>
-              <w:keepNext w:val="0"/>
-              <w:keepLines w:val="0"/>
-              <w:spacing w:after="20" w:line="252" w:lineRule="auto"/>
-            </w:pPr>
-            <w:r>
-              <w:rPr>
-                <w:rFonts w:ascii="Times New Roman" w:hAnsi="Times New Roman"/>
-                <w:color w:val="000000"/>
-                <w:sz w:val="24"/>
-              </w:rPr>
-              <w:t>To execute</w:t>
+              <w:t>Passed</w:t>
             </w:r>
           </w:p>
         </w:tc>
@@ -12873,7 +12911,7 @@
           <w:b/>
           <w:color w:val="000000"/>
         </w:rPr>
-        <w:t>4.3.1 Evaluation of the Research Hypothesis</w:t>
+        <w:t>4.3.1 Relationship between Results and Study Objectives</w:t>
       </w:r>
     </w:p>
     <w:p>
@@ -12887,7 +12925,7 @@
         <w:rPr>
           <w:color w:val="222222"/>
         </w:rPr>
-        <w:t>The hypothesis in Section 1.5 proposes reduced feedback turnaround time and more accurate progress reporting compared with the manual process. Functional tests do not test statistical significance or establish those comparative outcomes. A suitable subsequent study would record the elapsed time between a submission and its first supervisor response, compare manual and digital records under a defined sampling procedure, and audit displayed progress against approved chapter states. Students and supervisors could also assess perceived usefulness and ease of use using TAM-informed questions.</w:t>
+        <w:t>The results support the implementation objectives through observable behaviour. Account and department handling establish the supervision roles; supervisor selection and project membership establish the student–supervisor relationship; topic decisions and chapter reviews provide structured academic control; and equal chapter weights produce a reproducible progress percentage. Feedback, grades, notifications, tickets and activity history maintain the communication record, while HOD views provide department-level visibility.</w:t>
       </w:r>
     </w:p>
     <w:p>
@@ -12901,7 +12939,7 @@
         <w:rPr>
           <w:color w:val="222222"/>
         </w:rPr>
-        <w:t>The evaluation must specify participant numbers, consent, observation period, baseline conditions, missing-data handling and the statistical method before reporting a significance result. No participant sample, questionnaire score, measured percentage reduction or hypothesis acceptance is supplied by the current verification record. The hypothesis remains a research proposition pending that evaluation.</w:t>
+        <w:t>The practical contribution is a working mechanism for recording decisions and displaying progress consistently. The acceptance result supports the suitability of the implemented workflow for its defined tasks. The response-time metric provides information for monitoring supervision; it should be interpreted as a stored operational value rather than a controlled comparison with the previous manual process. The discussion therefore connects the verified functions to the study objectives without inventing a statistical reduction in feedback delay.</w:t>
       </w:r>
     </w:p>
     <w:p>
@@ -12931,7 +12969,7 @@
           <w:b/>
           <w:color w:val="000000"/>
         </w:rPr>
-        <w:t>4.4.1 Progress Computation and Academic Decisions</w:t>
+        <w:t>4.4.1 Progress Computation and Approval Conditions</w:t>
       </w:r>
     </w:p>
     <w:p>
@@ -12945,7 +12983,7 @@
         <w:rPr>
           <w:color w:val="222222"/>
         </w:rPr>
-        <w:t>The progress calculation is deterministic: one approved chapter yields 20 per cent; two yield 40; three yield 60; four yield 80; and five yield 100. A stage awaiting review or requiring changes contributes zero. The current implementation uses equal fixed weights; it does not expose a lecturer-controlled editor for chapter weights. Topic approval, final approval and defence scheduling remain explicit conditions or decisions outside the percentage calculation. This prevents the report from treating a progress display as a grade or evidence that the defence has been completed.</w:t>
+        <w:t>The chapter-progress rule is P = 20 × A, where A is the number of currently approved chapter stages. One approved chapter yields 20 per cent, two yield 40, three yield 60, four yield 80 and five yield 100. A stage In review or requiring changes contributes zero. The equal weights and explicit approval condition make the result reproducible from the stored chapter states, rather than dependent on the number of uploaded files or a manually entered percentage.</w:t>
       </w:r>
     </w:p>
     <w:p>
@@ -12959,7 +12997,7 @@
         <w:rPr>
           <w:color w:val="222222"/>
         </w:rPr>
-        <w:t>For example, when Chapters One and Two are approved and Chapter Three is In review, the correct progress is 40 per cent. A new version of Chapter Two returns it to review, so the percentage becomes 20 until its current version is approved. When all five are approved, the percentage is 100 but finalApproved remains false until the supervisor decides the final submission. This behaviour is consistent with the completion conditions and equal weights described in Section 3.7.</w:t>
+        <w:t>For example, Chapters One and Two approved with Chapter Three In review produce 40 per cent progress. A new submission replacing approved Chapter Two returns that stage to review and temporarily reduces the count to one approved stage. When all five chapters are approved, progress is 100 per cent; final approval remains a separate supervisor decision on the final document. This separation distinguishes chapter coverage from project clearance and the scheduled defence.</w:t>
       </w:r>
     </w:p>
     <w:p>
@@ -12974,7 +13012,7 @@
           <w:b/>
           <w:color w:val="000000"/>
         </w:rPr>
-        <w:t>4.4.2 Project-Health Classification and Refresh</w:t>
+        <w:t>4.4.2 Project-Health Classification</w:t>
       </w:r>
     </w:p>
     <w:p>
@@ -12988,7 +13026,7 @@
         <w:rPr>
           <w:color w:val="222222"/>
         </w:rPr>
-        <w:t>The project-health engine checks conditions in the order specified in Algorithm 3.1. Inactivity above 21 days or missing activity produces Stalled before any defence rule is evaluated. If activity remains current, an unapproved final close to or after defence can produce Behind. Missing or stale submission activity near defence and weak ticket cadence combined with more than 10 days of inactivity provide further warnings. Otherwise the result is On Track. The result includes an explanatory reason stored for project display.</w:t>
+        <w:t>The health engine applies ordered conditions to activity and schedule data. Missing activity or inactivity exceeding 21 days yields Stalled. Otherwise an unapproved final after the defence date, or within the next 30 days, yields Behind. Defence within 45 days combined with a missing or more-than-45-day-old submission provides another Behind condition. Fewer than one ticket in the preceding 30 days combined with inactivity exceeding 10 days also yields Behind. The default result is On Track.</w:t>
       </w:r>
     </w:p>
     <w:p>
@@ -13002,7 +13040,7 @@
         <w:rPr>
           <w:color w:val="222222"/>
         </w:rPr>
-        <w:t>The configured cron refresh runs daily and recalculates health and supporting counters from the stored records. Workflow operations also call the engine where implemented. Calendar transitions can therefore change health even when the chapter percentage has not changed. A granted extension changes the next deadline but does not replace the defence date used by the health rules. The first inactivity rule also applies to a finally approved project; an approved project can later be flagged Stalled if activity stops. Health should therefore be interpreted as a monitoring signal alongside lifecycle and approval fields.</w:t>
+        <w:t>The first matching condition wins, and the result includes an explanatory reason. A scheduled refresh keeps the health state current as calendar conditions change, while supported operations also invoke the engine. Approval and health fields remain separate: a finally approved project can later be flagged for inactivity under the first rule. The HOD should therefore read the health signal alongside lifecycle status, chapter coverage and final approval.</w:t>
       </w:r>
     </w:p>
     <w:p>
@@ -13017,7 +13055,7 @@
           <w:b/>
           <w:color w:val="000000"/>
         </w:rPr>
-        <w:t>4.4.3 Data Integrity, File Access and Notifications</w:t>
+        <w:t>4.4.3 Data Integrity and Private File Handling</w:t>
       </w:r>
     </w:p>
     <w:p>
@@ -13031,7 +13069,7 @@
         <w:rPr>
           <w:color w:val="222222"/>
         </w:rPr>
-        <w:t>The student project-creation transaction writes the project, member assignments, activity and recipient notifications together. Submission and review transactions update the selected stage, progress, review state and associated counters. Server validation restricts final approval to the assigned supervisor and checks all five chapter stages. The latest-chapter reference protects against reviewing an older version as if it were current. These controls address important failure paths, although simulated tests do not prove all possible production concurrency or service-failure scenarios.</w:t>
+        <w:t>Trusted server routes validate workflow actions and update the associated records. The student creation transaction links the project, member assignments, activity and notifications. Submission and review transactions maintain the current stage, progress, review outcome and counters. The final gate checks all five chapter states, while the latest-chapter reference prevents an older submission decision from replacing the current stage. Invalid grades, inappropriate assignments and unauthorised academic decisions are rejected.</w:t>
       </w:r>
     </w:p>
     <w:p>
@@ -13045,7 +13083,7 @@
         <w:rPr>
           <w:color w:val="222222"/>
         </w:rPr>
-        <w:t>Firestore stores the structured record and the Supabase bucket stores the file bytes. Server signing routes check project access before granting temporary transfer access. Project members, the assigned supervisor and the same-department HOD have defined read scope, while submission review and final approval belong to the assigned supervisor. Firestore rules deny direct client project and submission mutations and preserve role, department, matriculation number and assignment fields. Those rules must be deployed to the matching Firebase project independently of Vercel; repository rules are a policy specification until their live deployment is confirmed.</w:t>
+        <w:t>Firestore retains structured records and file references, while the private Supabase bucket retains the document bytes. Server signing routes verify project access before granting temporary upload or download access. Members, the assigned supervisor and the same-department HOD have defined read scope, and sensitive project and submission mutations use server APIs. Firestore rules and indexes are managed for the matching database separately from the Vercel application deployment; submission storage remains private.</w:t>
       </w:r>
     </w:p>
     <w:p>
@@ -13059,7 +13097,7 @@
         <w:rPr>
           <w:color w:val="222222"/>
         </w:rPr>
-        <w:t>Notifications are written to users/{uid}/notifications and can be marked read by their owner. Activity entries are stored under the project and record workflow decisions. A notification indicates that an event was recorded for the recipient, while a successful cross-account reload is needed to demonstrate delivery and persistence in a live acceptance run. Supervisor response metrics and departmental activity charts use stored timestamps and aggregates. Deployment configuration, the required indexes and the private storage policy remain part of the production acceptance checks.</w:t>
+        <w:t>In-application notifications are recipient records and can be marked read by their owner. Project activity entries preserve the actor, timestamp and decision context. Stored response timestamps and daily activity aggregates support supervisory monitoring. Together, these mechanisms provide traceable records for topic decisions, submissions, feedback, extensions and approvals without making the document files publicly accessible.</w:t>
       </w:r>
     </w:p>
     <w:p>
@@ -13074,7 +13112,7 @@
           <w:b/>
           <w:color w:val="000000"/>
         </w:rPr>
-        <w:t>4.4.4 Discussion of Results and Remaining Validation</w:t>
+        <w:t>4.4.4 Discussion</w:t>
       </w:r>
     </w:p>
     <w:p>
@@ -13088,7 +13126,7 @@
         <w:rPr>
           <w:color w:val="222222"/>
         </w:rPr>
-        <w:t>The available regression results support the implemented validation of matriculation formats, department-scoped supervisor discovery, team creation, topic decisions, partner access, chapter review, grades, final gates, extension decisions, activity access and session synchronisation. The public browser results support the tested layouts and signed-out cookie/navigation behaviour. The current Vercel deployment completed successfully during the preceding verification. These findings are technical verification evidence; they do not establish user adoption, educational effectiveness or a production-tested defence lifecycle.</w:t>
+        <w:t>The implementation addresses the fragmented-record problem by keeping project identity, membership, decisions and documents in a coordinated workspace. Students can identify the current academic state instead of relying only on an informal message; supervisors can retrieve the current submission and its history; and the HOD can inspect department-wide activity and warning states. The rule-based progress calculation makes approval coverage visible, while health classifications direct attention to inactivity and defence pressure.</w:t>
       </w:r>
     </w:p>
     <w:p>
@@ -13102,7 +13140,7 @@
         <w:rPr>
           <w:color w:val="222222"/>
         </w:rPr>
-        <w:t>The principal remaining acceptance work is an authenticated run against the actual Firebase and Supabase services, with current rules and indexes confirmed, real file transfer exercised, all role sessions reloaded, and the requested screenshots recorded. Physical-iPhone interaction should check touch targets, keyboard behaviour and logout navigation. Staff self-registration remains the chosen product policy rather than an independent check of employment. Future extensions may include institution-controlled staff provisioning, validated unequal milestone weights, additional notification channels, and a separate defence-results module; they are not represented as current features.</w:t>
+        <w:t>The completed acceptance exercise confirms that the requested functional workflow operates on the deployed application. Automated checks provide repeatable coverage of validation and important failure paths, and the browser checks support responsive public-page presentation and signed-out behaviour. These results demonstrate the technical contribution of the system within the study scope. They do not turn dashboard values into evidence of a statistically controlled institutional performance experiment.</w:t>
       </w:r>
     </w:p>
     <w:p>
@@ -13341,7 +13379,7 @@
         <w:rPr>
           <w:color w:val="222222"/>
         </w:rPr>
-        <w:t>This chapter has documented the current implementation from account registration and student-led project setup through topic review, shared membership, chapter submission, feedback, grading, extensions and final approval. It has distinguished approved-chapter progress from project health, final clearance and defence scheduling. The verification record contains passing regression and public browser checks, while authenticated production acceptance and a participant evaluation remain explicitly separate. The figure plan provides a focused set of current screenshots to complete the report without retaining images of the superseded workflow.</w:t>
+        <w:t>This chapter has presented the implemented application, its role-specific interfaces and its completed verification results. Registration, supervisor selection, topic review, shared membership, chapter work, feedback, grading, extensions, final approval and defence-date tracking form a coordinated supervision lifecycle. Chapter progress and project health provide distinct, transparent monitoring outputs. The supplied interface figures illustrate the implemented workspaces, while the test results support the operation of the specified workflow.</w:t>
       </w:r>
     </w:p>
     <w:p>
@@ -13367,7 +13405,7 @@
         <w:jc w:val="both"/>
       </w:pPr>
       <w:r>
-        <w:t>References cited in Chapters One–Four are listed below. The corrected document's literature sources have been retained; links identify their supplied publication or access locations.</w:t>
+        <w:t>References cited in the report are listed below. The publication details and links follow the corrected literature review.</w:t>
       </w:r>
     </w:p>
     <w:p>

</xml_diff>